<commit_message>
docs: add project documentation PDF, update README quick start, and refine doc generation
</commit_message>
<xml_diff>
--- a/docs/ALPAS_Project_Documentation.docx
+++ b/docs/ALPAS_Project_Documentation.docx
@@ -4437,6 +4437,18 @@
     </w:p>
     <w:p>
       <w:pPr>
+        <w:spacing w:after="160"/>
+      </w:pPr>
+      <w:r>
+        <w:rPr>
+          <w:sz w:val="24"/>
+          <w:szCs w:val="24"/>
+        </w:rPr>
+        <w:t xml:space="preserve">To evaluate building safety margins, a series of deterministic and agent-based simulation scenarios were executed. The primary objective was to observe the transition from a highly hazardous, low-safety egress environment to a completely mitigated, casualty-free environment under a Slow t² fire growth rate and 60 occupants on the 3rd Floor Corridor (origin near Room 304):</w:t>
+      </w:r>
+    </w:p>
+    <w:p>
+      <w:pPr>
         <w:pStyle w:val="ListParagraph"/>
         <w:numPr>
           <w:ilvl w:val="0"/>
@@ -4449,7 +4461,7 @@
           <w:sz w:val="24"/>
           <w:szCs w:val="24"/>
         </w:rPr>
-        <w:t xml:space="preserve">Default demo: 60 occupants, medium growth, 1.2 MW, fire in corridor, origin Room 304, mitigations on.</w:t>
+        <w:t xml:space="preserve">Scenario 1: Baseline Control — Baseline parameters with all active safety systems disabled (no mitigations).</w:t>
       </w:r>
     </w:p>
     <w:p>
@@ -4466,7 +4478,7 @@
           <w:sz w:val="24"/>
           <w:szCs w:val="24"/>
         </w:rPr>
-        <w:t xml:space="preserve">High-load stress: increased occ and fast growth with mitigations disabled (baseline).</w:t>
+        <w:t xml:space="preserve">Scenario 2: Single-Mitigation Isolation (Scenario 2A) — Automatic wet-pipe sprinklers active (sprinkler temperature threshold: 68°C, RTI: 50).</w:t>
       </w:r>
     </w:p>
     <w:p>
@@ -4483,7 +4495,7 @@
           <w:sz w:val="24"/>
           <w:szCs w:val="24"/>
         </w:rPr>
-        <w:t xml:space="preserve">Location sweep: waiting area vs classroom vs stairwell fire origins.</w:t>
+        <w:t xml:space="preserve">Scenario 3: Multi-System Synergistic Interventions — Multi-mitigation configurations including Scenario 3A (Sprinklers + Vents), Scenario 3B (Sprinklers + Vents + AI Signage), and Scenario 3C (Sprinklers + Fire Doors + Vents + AI Signage).</w:t>
       </w:r>
     </w:p>
     <w:p>
@@ -4500,7 +4512,7 @@
           <w:sz w:val="24"/>
           <w:szCs w:val="24"/>
         </w:rPr>
-        <w:t xml:space="preserve">FDS pipeline: backend-generated school_{uuid}.fds with 40 agents, 60 s horizon.</w:t>
+        <w:t xml:space="preserve">Scenario 4: High-Capacity Structural Upgrades — Advanced configurations including Scenario 4A (Sprinklers + Fire Doors + Vents + AI Signage + Wider Exits) and Scenario 4B (Full Suite with Stairwell Pressurization).</w:t>
       </w:r>
     </w:p>
     <w:p>
@@ -4520,7 +4532,2441 @@
           <w:sz w:val="24"/>
           <w:szCs w:val="24"/>
         </w:rPr>
-        <w:t xml:space="preserve">Quick analysis typically shows improved safety margin when sprinklers, fire doors, and smoke vents are combined; the mitigation narrative in computeMitigationComparison quantifies margin gain in seconds and casualty reduction. FDS runs produce device CSV series for visibility and temperature; ASET is estimated when visibility &lt; 10 m or temperature &gt; 60°C at the probe. AI Analyst consumes analysis.json and run.log to summarize findings for non-technical stakeholders.</w:t>
+        <w:t xml:space="preserve">To avoid clipping and fit standard document layout margins, the quantitative metrics are divided into two distinct tables: Scenario Configurations (Table 6.1) and Performance Outcomes (Table 6.2).</w:t>
+      </w:r>
+    </w:p>
+    <w:p>
+      <w:pPr>
+        <w:spacing w:after="160"/>
+      </w:pPr>
+      <w:r>
+        <w:rPr>
+          <w:sz w:val="24"/>
+          <w:szCs w:val="24"/>
+        </w:rPr>
+        <w:t xml:space="preserve">Table 6.1 — Simulation Scenario Setup &amp; Configurations:</w:t>
+      </w:r>
+    </w:p>
+    <w:tbl>
+      <w:tblPr>
+        <w:tblW w:type="dxa" w:w="9360"/>
+        <w:tblBorders>
+          <w:top w:val="single" w:color="auto" w:sz="4"/>
+          <w:left w:val="single" w:color="auto" w:sz="4"/>
+          <w:bottom w:val="single" w:color="auto" w:sz="4"/>
+          <w:right w:val="single" w:color="auto" w:sz="4"/>
+          <w:insideH w:val="single" w:color="auto" w:sz="4"/>
+          <w:insideV w:val="single" w:color="auto" w:sz="4"/>
+        </w:tblBorders>
+      </w:tblPr>
+      <w:tblGrid>
+        <w:gridCol w:w="1500"/>
+        <w:gridCol w:w="2800"/>
+        <w:gridCol w:w="5060"/>
+      </w:tblGrid>
+      <w:tr>
+        <w:tc>
+          <w:tcPr>
+            <w:tcW w:type="dxa" w:w="1500"/>
+            <w:tcBorders>
+              <w:top w:val="single" w:color="CCCCCC" w:sz="1"/>
+              <w:left w:val="single" w:color="CCCCCC" w:sz="1"/>
+              <w:bottom w:val="single" w:color="CCCCCC" w:sz="1"/>
+              <w:right w:val="single" w:color="CCCCCC" w:sz="1"/>
+            </w:tcBorders>
+            <w:shd w:fill="D5E8F0" w:val="clear"/>
+            <w:tcMar>
+              <w:top w:type="dxa" w:w="80"/>
+              <w:left w:type="dxa" w:w="120"/>
+              <w:bottom w:type="dxa" w:w="80"/>
+              <w:right w:type="dxa" w:w="120"/>
+            </w:tcMar>
+          </w:tcPr>
+          <w:p>
+            <w:r>
+              <w:rPr>
+                <w:b/>
+                <w:bCs/>
+                <w:sz w:val="22"/>
+                <w:szCs w:val="22"/>
+              </w:rPr>
+              <w:t xml:space="preserve">Run ID</w:t>
+            </w:r>
+          </w:p>
+        </w:tc>
+        <w:tc>
+          <w:tcPr>
+            <w:tcW w:type="dxa" w:w="2800"/>
+            <w:tcBorders>
+              <w:top w:val="single" w:color="CCCCCC" w:sz="1"/>
+              <w:left w:val="single" w:color="CCCCCC" w:sz="1"/>
+              <w:bottom w:val="single" w:color="CCCCCC" w:sz="1"/>
+              <w:right w:val="single" w:color="CCCCCC" w:sz="1"/>
+            </w:tcBorders>
+            <w:shd w:fill="D5E8F0" w:val="clear"/>
+            <w:tcMar>
+              <w:top w:type="dxa" w:w="80"/>
+              <w:left w:type="dxa" w:w="120"/>
+              <w:bottom w:type="dxa" w:w="80"/>
+              <w:right w:type="dxa" w:w="120"/>
+            </w:tcMar>
+          </w:tcPr>
+          <w:p>
+            <w:r>
+              <w:rPr>
+                <w:b/>
+                <w:bCs/>
+                <w:sz w:val="22"/>
+                <w:szCs w:val="22"/>
+              </w:rPr>
+              <w:t xml:space="preserve">Scenario Name / Classification</w:t>
+            </w:r>
+          </w:p>
+        </w:tc>
+        <w:tc>
+          <w:tcPr>
+            <w:tcW w:type="dxa" w:w="5060"/>
+            <w:tcBorders>
+              <w:top w:val="single" w:color="CCCCCC" w:sz="1"/>
+              <w:left w:val="single" w:color="CCCCCC" w:sz="1"/>
+              <w:bottom w:val="single" w:color="CCCCCC" w:sz="1"/>
+              <w:right w:val="single" w:color="CCCCCC" w:sz="1"/>
+            </w:tcBorders>
+            <w:shd w:fill="D5E8F0" w:val="clear"/>
+            <w:tcMar>
+              <w:top w:type="dxa" w:w="80"/>
+              <w:left w:type="dxa" w:w="120"/>
+              <w:bottom w:type="dxa" w:w="80"/>
+              <w:right w:type="dxa" w:w="120"/>
+            </w:tcMar>
+          </w:tcPr>
+          <w:p>
+            <w:r>
+              <w:rPr>
+                <w:b/>
+                <w:bCs/>
+                <w:sz w:val="22"/>
+                <w:szCs w:val="22"/>
+              </w:rPr>
+              <w:t xml:space="preserve">Active Safety Mitigations Installed</w:t>
+            </w:r>
+          </w:p>
+        </w:tc>
+      </w:tr>
+      <w:tr>
+        <w:tc>
+          <w:tcPr>
+            <w:tcW w:type="dxa" w:w="1500"/>
+            <w:tcBorders>
+              <w:top w:val="single" w:color="CCCCCC" w:sz="1"/>
+              <w:left w:val="single" w:color="CCCCCC" w:sz="1"/>
+              <w:bottom w:val="single" w:color="CCCCCC" w:sz="1"/>
+              <w:right w:val="single" w:color="CCCCCC" w:sz="1"/>
+            </w:tcBorders>
+            <w:shd w:fill="FFFFFF" w:val="clear"/>
+            <w:tcMar>
+              <w:top w:type="dxa" w:w="80"/>
+              <w:left w:type="dxa" w:w="120"/>
+              <w:bottom w:type="dxa" w:w="80"/>
+              <w:right w:type="dxa" w:w="120"/>
+            </w:tcMar>
+          </w:tcPr>
+          <w:p>
+            <w:r>
+              <w:rPr>
+                <w:b w:val="false"/>
+                <w:bCs w:val="false"/>
+                <w:sz w:val="22"/>
+                <w:szCs w:val="22"/>
+              </w:rPr>
+              <w:t xml:space="preserve">8ee3aaa1</w:t>
+            </w:r>
+          </w:p>
+        </w:tc>
+        <w:tc>
+          <w:tcPr>
+            <w:tcW w:type="dxa" w:w="2800"/>
+            <w:tcBorders>
+              <w:top w:val="single" w:color="CCCCCC" w:sz="1"/>
+              <w:left w:val="single" w:color="CCCCCC" w:sz="1"/>
+              <w:bottom w:val="single" w:color="CCCCCC" w:sz="1"/>
+              <w:right w:val="single" w:color="CCCCCC" w:sz="1"/>
+            </w:tcBorders>
+            <w:shd w:fill="FFFFFF" w:val="clear"/>
+            <w:tcMar>
+              <w:top w:type="dxa" w:w="80"/>
+              <w:left w:type="dxa" w:w="120"/>
+              <w:bottom w:type="dxa" w:w="80"/>
+              <w:right w:type="dxa" w:w="120"/>
+            </w:tcMar>
+          </w:tcPr>
+          <w:p>
+            <w:r>
+              <w:rPr>
+                <w:b w:val="false"/>
+                <w:bCs w:val="false"/>
+                <w:sz w:val="22"/>
+                <w:szCs w:val="22"/>
+              </w:rPr>
+              <w:t xml:space="preserve">Baseline (Scenario 1)</w:t>
+            </w:r>
+          </w:p>
+        </w:tc>
+        <w:tc>
+          <w:tcPr>
+            <w:tcW w:type="dxa" w:w="5060"/>
+            <w:tcBorders>
+              <w:top w:val="single" w:color="CCCCCC" w:sz="1"/>
+              <w:left w:val="single" w:color="CCCCCC" w:sz="1"/>
+              <w:bottom w:val="single" w:color="CCCCCC" w:sz="1"/>
+              <w:right w:val="single" w:color="CCCCCC" w:sz="1"/>
+            </w:tcBorders>
+            <w:shd w:fill="FFFFFF" w:val="clear"/>
+            <w:tcMar>
+              <w:top w:type="dxa" w:w="80"/>
+              <w:left w:type="dxa" w:w="120"/>
+              <w:bottom w:type="dxa" w:w="80"/>
+              <w:right w:type="dxa" w:w="120"/>
+            </w:tcMar>
+          </w:tcPr>
+          <w:p>
+            <w:r>
+              <w:rPr>
+                <w:b w:val="false"/>
+                <w:bCs w:val="false"/>
+                <w:sz w:val="22"/>
+                <w:szCs w:val="22"/>
+              </w:rPr>
+              <w:t xml:space="preserve">None (Unmitigated Baseline Control)</w:t>
+            </w:r>
+          </w:p>
+        </w:tc>
+      </w:tr>
+      <w:tr>
+        <w:tc>
+          <w:tcPr>
+            <w:tcW w:type="dxa" w:w="1500"/>
+            <w:tcBorders>
+              <w:top w:val="single" w:color="CCCCCC" w:sz="1"/>
+              <w:left w:val="single" w:color="CCCCCC" w:sz="1"/>
+              <w:bottom w:val="single" w:color="CCCCCC" w:sz="1"/>
+              <w:right w:val="single" w:color="CCCCCC" w:sz="1"/>
+            </w:tcBorders>
+            <w:shd w:fill="FFFFFF" w:val="clear"/>
+            <w:tcMar>
+              <w:top w:type="dxa" w:w="80"/>
+              <w:left w:type="dxa" w:w="120"/>
+              <w:bottom w:type="dxa" w:w="80"/>
+              <w:right w:type="dxa" w:w="120"/>
+            </w:tcMar>
+          </w:tcPr>
+          <w:p>
+            <w:r>
+              <w:rPr>
+                <w:b w:val="false"/>
+                <w:bCs w:val="false"/>
+                <w:sz w:val="22"/>
+                <w:szCs w:val="22"/>
+              </w:rPr>
+              <w:t xml:space="preserve">9ca65484</w:t>
+            </w:r>
+          </w:p>
+        </w:tc>
+        <w:tc>
+          <w:tcPr>
+            <w:tcW w:type="dxa" w:w="2800"/>
+            <w:tcBorders>
+              <w:top w:val="single" w:color="CCCCCC" w:sz="1"/>
+              <w:left w:val="single" w:color="CCCCCC" w:sz="1"/>
+              <w:bottom w:val="single" w:color="CCCCCC" w:sz="1"/>
+              <w:right w:val="single" w:color="CCCCCC" w:sz="1"/>
+            </w:tcBorders>
+            <w:shd w:fill="FFFFFF" w:val="clear"/>
+            <w:tcMar>
+              <w:top w:type="dxa" w:w="80"/>
+              <w:left w:type="dxa" w:w="120"/>
+              <w:bottom w:type="dxa" w:w="80"/>
+              <w:right w:type="dxa" w:w="120"/>
+            </w:tcMar>
+          </w:tcPr>
+          <w:p>
+            <w:r>
+              <w:rPr>
+                <w:b w:val="false"/>
+                <w:bCs w:val="false"/>
+                <w:sz w:val="22"/>
+                <w:szCs w:val="22"/>
+              </w:rPr>
+              <w:t xml:space="preserve">Single (Scenario 2A)</w:t>
+            </w:r>
+          </w:p>
+        </w:tc>
+        <w:tc>
+          <w:tcPr>
+            <w:tcW w:type="dxa" w:w="5060"/>
+            <w:tcBorders>
+              <w:top w:val="single" w:color="CCCCCC" w:sz="1"/>
+              <w:left w:val="single" w:color="CCCCCC" w:sz="1"/>
+              <w:bottom w:val="single" w:color="CCCCCC" w:sz="1"/>
+              <w:right w:val="single" w:color="CCCCCC" w:sz="1"/>
+            </w:tcBorders>
+            <w:shd w:fill="FFFFFF" w:val="clear"/>
+            <w:tcMar>
+              <w:top w:type="dxa" w:w="80"/>
+              <w:left w:type="dxa" w:w="120"/>
+              <w:bottom w:type="dxa" w:w="80"/>
+              <w:right w:type="dxa" w:w="120"/>
+            </w:tcMar>
+          </w:tcPr>
+          <w:p>
+            <w:r>
+              <w:rPr>
+                <w:b w:val="false"/>
+                <w:bCs w:val="false"/>
+                <w:sz w:val="22"/>
+                <w:szCs w:val="22"/>
+              </w:rPr>
+              <w:t xml:space="preserve">Sprinklers Only</w:t>
+            </w:r>
+          </w:p>
+        </w:tc>
+      </w:tr>
+      <w:tr>
+        <w:tc>
+          <w:tcPr>
+            <w:tcW w:type="dxa" w:w="1500"/>
+            <w:tcBorders>
+              <w:top w:val="single" w:color="CCCCCC" w:sz="1"/>
+              <w:left w:val="single" w:color="CCCCCC" w:sz="1"/>
+              <w:bottom w:val="single" w:color="CCCCCC" w:sz="1"/>
+              <w:right w:val="single" w:color="CCCCCC" w:sz="1"/>
+            </w:tcBorders>
+            <w:shd w:fill="FFFFFF" w:val="clear"/>
+            <w:tcMar>
+              <w:top w:type="dxa" w:w="80"/>
+              <w:left w:type="dxa" w:w="120"/>
+              <w:bottom w:type="dxa" w:w="80"/>
+              <w:right w:type="dxa" w:w="120"/>
+            </w:tcMar>
+          </w:tcPr>
+          <w:p>
+            <w:r>
+              <w:rPr>
+                <w:b w:val="false"/>
+                <w:bCs w:val="false"/>
+                <w:sz w:val="22"/>
+                <w:szCs w:val="22"/>
+              </w:rPr>
+              <w:t xml:space="preserve">678383ec</w:t>
+            </w:r>
+          </w:p>
+        </w:tc>
+        <w:tc>
+          <w:tcPr>
+            <w:tcW w:type="dxa" w:w="2800"/>
+            <w:tcBorders>
+              <w:top w:val="single" w:color="CCCCCC" w:sz="1"/>
+              <w:left w:val="single" w:color="CCCCCC" w:sz="1"/>
+              <w:bottom w:val="single" w:color="CCCCCC" w:sz="1"/>
+              <w:right w:val="single" w:color="CCCCCC" w:sz="1"/>
+            </w:tcBorders>
+            <w:shd w:fill="FFFFFF" w:val="clear"/>
+            <w:tcMar>
+              <w:top w:type="dxa" w:w="80"/>
+              <w:left w:type="dxa" w:w="120"/>
+              <w:bottom w:type="dxa" w:w="80"/>
+              <w:right w:type="dxa" w:w="120"/>
+            </w:tcMar>
+          </w:tcPr>
+          <w:p>
+            <w:r>
+              <w:rPr>
+                <w:b w:val="false"/>
+                <w:bCs w:val="false"/>
+                <w:sz w:val="22"/>
+                <w:szCs w:val="22"/>
+              </w:rPr>
+              <w:t xml:space="preserve">Dual (Scenario 3A)</w:t>
+            </w:r>
+          </w:p>
+        </w:tc>
+        <w:tc>
+          <w:tcPr>
+            <w:tcW w:type="dxa" w:w="5060"/>
+            <w:tcBorders>
+              <w:top w:val="single" w:color="CCCCCC" w:sz="1"/>
+              <w:left w:val="single" w:color="CCCCCC" w:sz="1"/>
+              <w:bottom w:val="single" w:color="CCCCCC" w:sz="1"/>
+              <w:right w:val="single" w:color="CCCCCC" w:sz="1"/>
+            </w:tcBorders>
+            <w:shd w:fill="FFFFFF" w:val="clear"/>
+            <w:tcMar>
+              <w:top w:type="dxa" w:w="80"/>
+              <w:left w:type="dxa" w:w="120"/>
+              <w:bottom w:type="dxa" w:w="80"/>
+              <w:right w:type="dxa" w:w="120"/>
+            </w:tcMar>
+          </w:tcPr>
+          <w:p>
+            <w:r>
+              <w:rPr>
+                <w:b w:val="false"/>
+                <w:bCs w:val="false"/>
+                <w:sz w:val="22"/>
+                <w:szCs w:val="22"/>
+              </w:rPr>
+              <w:t xml:space="preserve">Sprinklers, Smoke Vents</w:t>
+            </w:r>
+          </w:p>
+        </w:tc>
+      </w:tr>
+      <w:tr>
+        <w:tc>
+          <w:tcPr>
+            <w:tcW w:type="dxa" w:w="1500"/>
+            <w:tcBorders>
+              <w:top w:val="single" w:color="CCCCCC" w:sz="1"/>
+              <w:left w:val="single" w:color="CCCCCC" w:sz="1"/>
+              <w:bottom w:val="single" w:color="CCCCCC" w:sz="1"/>
+              <w:right w:val="single" w:color="CCCCCC" w:sz="1"/>
+            </w:tcBorders>
+            <w:shd w:fill="FFFFFF" w:val="clear"/>
+            <w:tcMar>
+              <w:top w:type="dxa" w:w="80"/>
+              <w:left w:type="dxa" w:w="120"/>
+              <w:bottom w:type="dxa" w:w="80"/>
+              <w:right w:type="dxa" w:w="120"/>
+            </w:tcMar>
+          </w:tcPr>
+          <w:p>
+            <w:r>
+              <w:rPr>
+                <w:b w:val="false"/>
+                <w:bCs w:val="false"/>
+                <w:sz w:val="22"/>
+                <w:szCs w:val="22"/>
+              </w:rPr>
+              <w:t xml:space="preserve">be143ae9</w:t>
+            </w:r>
+          </w:p>
+        </w:tc>
+        <w:tc>
+          <w:tcPr>
+            <w:tcW w:type="dxa" w:w="2800"/>
+            <w:tcBorders>
+              <w:top w:val="single" w:color="CCCCCC" w:sz="1"/>
+              <w:left w:val="single" w:color="CCCCCC" w:sz="1"/>
+              <w:bottom w:val="single" w:color="CCCCCC" w:sz="1"/>
+              <w:right w:val="single" w:color="CCCCCC" w:sz="1"/>
+            </w:tcBorders>
+            <w:shd w:fill="FFFFFF" w:val="clear"/>
+            <w:tcMar>
+              <w:top w:type="dxa" w:w="80"/>
+              <w:left w:type="dxa" w:w="120"/>
+              <w:bottom w:type="dxa" w:w="80"/>
+              <w:right w:type="dxa" w:w="120"/>
+            </w:tcMar>
+          </w:tcPr>
+          <w:p>
+            <w:r>
+              <w:rPr>
+                <w:b w:val="false"/>
+                <w:bCs w:val="false"/>
+                <w:sz w:val="22"/>
+                <w:szCs w:val="22"/>
+              </w:rPr>
+              <w:t xml:space="preserve">Dual (Scenario 3A)</w:t>
+            </w:r>
+          </w:p>
+        </w:tc>
+        <w:tc>
+          <w:tcPr>
+            <w:tcW w:type="dxa" w:w="5060"/>
+            <w:tcBorders>
+              <w:top w:val="single" w:color="CCCCCC" w:sz="1"/>
+              <w:left w:val="single" w:color="CCCCCC" w:sz="1"/>
+              <w:bottom w:val="single" w:color="CCCCCC" w:sz="1"/>
+              <w:right w:val="single" w:color="CCCCCC" w:sz="1"/>
+            </w:tcBorders>
+            <w:shd w:fill="FFFFFF" w:val="clear"/>
+            <w:tcMar>
+              <w:top w:type="dxa" w:w="80"/>
+              <w:left w:type="dxa" w:w="120"/>
+              <w:bottom w:type="dxa" w:w="80"/>
+              <w:right w:type="dxa" w:w="120"/>
+            </w:tcMar>
+          </w:tcPr>
+          <w:p>
+            <w:r>
+              <w:rPr>
+                <w:b w:val="false"/>
+                <w:bCs w:val="false"/>
+                <w:sz w:val="22"/>
+                <w:szCs w:val="22"/>
+              </w:rPr>
+              <w:t xml:space="preserve">Sprinklers, Smoke Vents</w:t>
+            </w:r>
+          </w:p>
+        </w:tc>
+      </w:tr>
+      <w:tr>
+        <w:tc>
+          <w:tcPr>
+            <w:tcW w:type="dxa" w:w="1500"/>
+            <w:tcBorders>
+              <w:top w:val="single" w:color="CCCCCC" w:sz="1"/>
+              <w:left w:val="single" w:color="CCCCCC" w:sz="1"/>
+              <w:bottom w:val="single" w:color="CCCCCC" w:sz="1"/>
+              <w:right w:val="single" w:color="CCCCCC" w:sz="1"/>
+            </w:tcBorders>
+            <w:shd w:fill="FFFFFF" w:val="clear"/>
+            <w:tcMar>
+              <w:top w:type="dxa" w:w="80"/>
+              <w:left w:type="dxa" w:w="120"/>
+              <w:bottom w:type="dxa" w:w="80"/>
+              <w:right w:type="dxa" w:w="120"/>
+            </w:tcMar>
+          </w:tcPr>
+          <w:p>
+            <w:r>
+              <w:rPr>
+                <w:b w:val="false"/>
+                <w:bCs w:val="false"/>
+                <w:sz w:val="22"/>
+                <w:szCs w:val="22"/>
+              </w:rPr>
+              <w:t xml:space="preserve">cbc849af</w:t>
+            </w:r>
+          </w:p>
+        </w:tc>
+        <w:tc>
+          <w:tcPr>
+            <w:tcW w:type="dxa" w:w="2800"/>
+            <w:tcBorders>
+              <w:top w:val="single" w:color="CCCCCC" w:sz="1"/>
+              <w:left w:val="single" w:color="CCCCCC" w:sz="1"/>
+              <w:bottom w:val="single" w:color="CCCCCC" w:sz="1"/>
+              <w:right w:val="single" w:color="CCCCCC" w:sz="1"/>
+            </w:tcBorders>
+            <w:shd w:fill="FFFFFF" w:val="clear"/>
+            <w:tcMar>
+              <w:top w:type="dxa" w:w="80"/>
+              <w:left w:type="dxa" w:w="120"/>
+              <w:bottom w:type="dxa" w:w="80"/>
+              <w:right w:type="dxa" w:w="120"/>
+            </w:tcMar>
+          </w:tcPr>
+          <w:p>
+            <w:r>
+              <w:rPr>
+                <w:b w:val="false"/>
+                <w:bCs w:val="false"/>
+                <w:sz w:val="22"/>
+                <w:szCs w:val="22"/>
+              </w:rPr>
+              <w:t xml:space="preserve">Triple (Scenario 3B)</w:t>
+            </w:r>
+          </w:p>
+        </w:tc>
+        <w:tc>
+          <w:tcPr>
+            <w:tcW w:type="dxa" w:w="5060"/>
+            <w:tcBorders>
+              <w:top w:val="single" w:color="CCCCCC" w:sz="1"/>
+              <w:left w:val="single" w:color="CCCCCC" w:sz="1"/>
+              <w:bottom w:val="single" w:color="CCCCCC" w:sz="1"/>
+              <w:right w:val="single" w:color="CCCCCC" w:sz="1"/>
+            </w:tcBorders>
+            <w:shd w:fill="FFFFFF" w:val="clear"/>
+            <w:tcMar>
+              <w:top w:type="dxa" w:w="80"/>
+              <w:left w:type="dxa" w:w="120"/>
+              <w:bottom w:type="dxa" w:w="80"/>
+              <w:right w:type="dxa" w:w="120"/>
+            </w:tcMar>
+          </w:tcPr>
+          <w:p>
+            <w:r>
+              <w:rPr>
+                <w:b w:val="false"/>
+                <w:bCs w:val="false"/>
+                <w:sz w:val="22"/>
+                <w:szCs w:val="22"/>
+              </w:rPr>
+              <w:t xml:space="preserve">Sprinklers, Smoke Vents, AI Signage</w:t>
+            </w:r>
+          </w:p>
+        </w:tc>
+      </w:tr>
+      <w:tr>
+        <w:tc>
+          <w:tcPr>
+            <w:tcW w:type="dxa" w:w="1500"/>
+            <w:tcBorders>
+              <w:top w:val="single" w:color="CCCCCC" w:sz="1"/>
+              <w:left w:val="single" w:color="CCCCCC" w:sz="1"/>
+              <w:bottom w:val="single" w:color="CCCCCC" w:sz="1"/>
+              <w:right w:val="single" w:color="CCCCCC" w:sz="1"/>
+            </w:tcBorders>
+            <w:shd w:fill="FFFFFF" w:val="clear"/>
+            <w:tcMar>
+              <w:top w:type="dxa" w:w="80"/>
+              <w:left w:type="dxa" w:w="120"/>
+              <w:bottom w:type="dxa" w:w="80"/>
+              <w:right w:type="dxa" w:w="120"/>
+            </w:tcMar>
+          </w:tcPr>
+          <w:p>
+            <w:r>
+              <w:rPr>
+                <w:b w:val="false"/>
+                <w:bCs w:val="false"/>
+                <w:sz w:val="22"/>
+                <w:szCs w:val="22"/>
+              </w:rPr>
+              <w:t xml:space="preserve">768ada18</w:t>
+            </w:r>
+          </w:p>
+        </w:tc>
+        <w:tc>
+          <w:tcPr>
+            <w:tcW w:type="dxa" w:w="2800"/>
+            <w:tcBorders>
+              <w:top w:val="single" w:color="CCCCCC" w:sz="1"/>
+              <w:left w:val="single" w:color="CCCCCC" w:sz="1"/>
+              <w:bottom w:val="single" w:color="CCCCCC" w:sz="1"/>
+              <w:right w:val="single" w:color="CCCCCC" w:sz="1"/>
+            </w:tcBorders>
+            <w:shd w:fill="FFFFFF" w:val="clear"/>
+            <w:tcMar>
+              <w:top w:type="dxa" w:w="80"/>
+              <w:left w:type="dxa" w:w="120"/>
+              <w:bottom w:type="dxa" w:w="80"/>
+              <w:right w:type="dxa" w:w="120"/>
+            </w:tcMar>
+          </w:tcPr>
+          <w:p>
+            <w:r>
+              <w:rPr>
+                <w:b w:val="false"/>
+                <w:bCs w:val="false"/>
+                <w:sz w:val="22"/>
+                <w:szCs w:val="22"/>
+              </w:rPr>
+              <w:t xml:space="preserve">Quad (Scenario 3C)</w:t>
+            </w:r>
+          </w:p>
+        </w:tc>
+        <w:tc>
+          <w:tcPr>
+            <w:tcW w:type="dxa" w:w="5060"/>
+            <w:tcBorders>
+              <w:top w:val="single" w:color="CCCCCC" w:sz="1"/>
+              <w:left w:val="single" w:color="CCCCCC" w:sz="1"/>
+              <w:bottom w:val="single" w:color="CCCCCC" w:sz="1"/>
+              <w:right w:val="single" w:color="CCCCCC" w:sz="1"/>
+            </w:tcBorders>
+            <w:shd w:fill="FFFFFF" w:val="clear"/>
+            <w:tcMar>
+              <w:top w:type="dxa" w:w="80"/>
+              <w:left w:type="dxa" w:w="120"/>
+              <w:bottom w:type="dxa" w:w="80"/>
+              <w:right w:type="dxa" w:w="120"/>
+            </w:tcMar>
+          </w:tcPr>
+          <w:p>
+            <w:r>
+              <w:rPr>
+                <w:b w:val="false"/>
+                <w:bCs w:val="false"/>
+                <w:sz w:val="22"/>
+                <w:szCs w:val="22"/>
+              </w:rPr>
+              <w:t xml:space="preserve">Sprinklers, Fire Doors, Vents, AI Signage</w:t>
+            </w:r>
+          </w:p>
+        </w:tc>
+      </w:tr>
+      <w:tr>
+        <w:tc>
+          <w:tcPr>
+            <w:tcW w:type="dxa" w:w="1500"/>
+            <w:tcBorders>
+              <w:top w:val="single" w:color="CCCCCC" w:sz="1"/>
+              <w:left w:val="single" w:color="CCCCCC" w:sz="1"/>
+              <w:bottom w:val="single" w:color="CCCCCC" w:sz="1"/>
+              <w:right w:val="single" w:color="CCCCCC" w:sz="1"/>
+            </w:tcBorders>
+            <w:shd w:fill="FFFFFF" w:val="clear"/>
+            <w:tcMar>
+              <w:top w:type="dxa" w:w="80"/>
+              <w:left w:type="dxa" w:w="120"/>
+              <w:bottom w:type="dxa" w:w="80"/>
+              <w:right w:type="dxa" w:w="120"/>
+            </w:tcMar>
+          </w:tcPr>
+          <w:p>
+            <w:r>
+              <w:rPr>
+                <w:b w:val="false"/>
+                <w:bCs w:val="false"/>
+                <w:sz w:val="22"/>
+                <w:szCs w:val="22"/>
+              </w:rPr>
+              <w:t xml:space="preserve">ecdebaec</w:t>
+            </w:r>
+          </w:p>
+        </w:tc>
+        <w:tc>
+          <w:tcPr>
+            <w:tcW w:type="dxa" w:w="2800"/>
+            <w:tcBorders>
+              <w:top w:val="single" w:color="CCCCCC" w:sz="1"/>
+              <w:left w:val="single" w:color="CCCCCC" w:sz="1"/>
+              <w:bottom w:val="single" w:color="CCCCCC" w:sz="1"/>
+              <w:right w:val="single" w:color="CCCCCC" w:sz="1"/>
+            </w:tcBorders>
+            <w:shd w:fill="FFFFFF" w:val="clear"/>
+            <w:tcMar>
+              <w:top w:type="dxa" w:w="80"/>
+              <w:left w:type="dxa" w:w="120"/>
+              <w:bottom w:type="dxa" w:w="80"/>
+              <w:right w:type="dxa" w:w="120"/>
+            </w:tcMar>
+          </w:tcPr>
+          <w:p>
+            <w:r>
+              <w:rPr>
+                <w:b w:val="false"/>
+                <w:bCs w:val="false"/>
+                <w:sz w:val="22"/>
+                <w:szCs w:val="22"/>
+              </w:rPr>
+              <w:t xml:space="preserve">Quint (Scenario 4A)</w:t>
+            </w:r>
+          </w:p>
+        </w:tc>
+        <w:tc>
+          <w:tcPr>
+            <w:tcW w:type="dxa" w:w="5060"/>
+            <w:tcBorders>
+              <w:top w:val="single" w:color="CCCCCC" w:sz="1"/>
+              <w:left w:val="single" w:color="CCCCCC" w:sz="1"/>
+              <w:bottom w:val="single" w:color="CCCCCC" w:sz="1"/>
+              <w:right w:val="single" w:color="CCCCCC" w:sz="1"/>
+            </w:tcBorders>
+            <w:shd w:fill="FFFFFF" w:val="clear"/>
+            <w:tcMar>
+              <w:top w:type="dxa" w:w="80"/>
+              <w:left w:type="dxa" w:w="120"/>
+              <w:bottom w:type="dxa" w:w="80"/>
+              <w:right w:type="dxa" w:w="120"/>
+            </w:tcMar>
+          </w:tcPr>
+          <w:p>
+            <w:r>
+              <w:rPr>
+                <w:b w:val="false"/>
+                <w:bCs w:val="false"/>
+                <w:sz w:val="22"/>
+                <w:szCs w:val="22"/>
+              </w:rPr>
+              <w:t xml:space="preserve">Sprinklers, Fire Doors, Vents, AI Signage, Wider Exits</w:t>
+            </w:r>
+          </w:p>
+        </w:tc>
+      </w:tr>
+      <w:tr>
+        <w:tc>
+          <w:tcPr>
+            <w:tcW w:type="dxa" w:w="1500"/>
+            <w:tcBorders>
+              <w:top w:val="single" w:color="CCCCCC" w:sz="1"/>
+              <w:left w:val="single" w:color="CCCCCC" w:sz="1"/>
+              <w:bottom w:val="single" w:color="CCCCCC" w:sz="1"/>
+              <w:right w:val="single" w:color="CCCCCC" w:sz="1"/>
+            </w:tcBorders>
+            <w:shd w:fill="FFFFFF" w:val="clear"/>
+            <w:tcMar>
+              <w:top w:type="dxa" w:w="80"/>
+              <w:left w:type="dxa" w:w="120"/>
+              <w:bottom w:type="dxa" w:w="80"/>
+              <w:right w:type="dxa" w:w="120"/>
+            </w:tcMar>
+          </w:tcPr>
+          <w:p>
+            <w:r>
+              <w:rPr>
+                <w:b w:val="false"/>
+                <w:bCs w:val="false"/>
+                <w:sz w:val="22"/>
+                <w:szCs w:val="22"/>
+              </w:rPr>
+              <w:t xml:space="preserve">950390a2</w:t>
+            </w:r>
+          </w:p>
+        </w:tc>
+        <w:tc>
+          <w:tcPr>
+            <w:tcW w:type="dxa" w:w="2800"/>
+            <w:tcBorders>
+              <w:top w:val="single" w:color="CCCCCC" w:sz="1"/>
+              <w:left w:val="single" w:color="CCCCCC" w:sz="1"/>
+              <w:bottom w:val="single" w:color="CCCCCC" w:sz="1"/>
+              <w:right w:val="single" w:color="CCCCCC" w:sz="1"/>
+            </w:tcBorders>
+            <w:shd w:fill="FFFFFF" w:val="clear"/>
+            <w:tcMar>
+              <w:top w:type="dxa" w:w="80"/>
+              <w:left w:type="dxa" w:w="120"/>
+              <w:bottom w:type="dxa" w:w="80"/>
+              <w:right w:type="dxa" w:w="120"/>
+            </w:tcMar>
+          </w:tcPr>
+          <w:p>
+            <w:r>
+              <w:rPr>
+                <w:b w:val="false"/>
+                <w:bCs w:val="false"/>
+                <w:sz w:val="22"/>
+                <w:szCs w:val="22"/>
+              </w:rPr>
+              <w:t xml:space="preserve">Full (Scenario 4B)</w:t>
+            </w:r>
+          </w:p>
+        </w:tc>
+        <w:tc>
+          <w:tcPr>
+            <w:tcW w:type="dxa" w:w="5060"/>
+            <w:tcBorders>
+              <w:top w:val="single" w:color="CCCCCC" w:sz="1"/>
+              <w:left w:val="single" w:color="CCCCCC" w:sz="1"/>
+              <w:bottom w:val="single" w:color="CCCCCC" w:sz="1"/>
+              <w:right w:val="single" w:color="CCCCCC" w:sz="1"/>
+            </w:tcBorders>
+            <w:shd w:fill="FFFFFF" w:val="clear"/>
+            <w:tcMar>
+              <w:top w:type="dxa" w:w="80"/>
+              <w:left w:type="dxa" w:w="120"/>
+              <w:bottom w:type="dxa" w:w="80"/>
+              <w:right w:type="dxa" w:w="120"/>
+            </w:tcMar>
+          </w:tcPr>
+          <w:p>
+            <w:r>
+              <w:rPr>
+                <w:b w:val="false"/>
+                <w:bCs w:val="false"/>
+                <w:sz w:val="22"/>
+                <w:szCs w:val="22"/>
+              </w:rPr>
+              <w:t xml:space="preserve">Sprinklers, Fire Doors, Vents, AI Signage, Wider, Pressurization</w:t>
+            </w:r>
+          </w:p>
+        </w:tc>
+      </w:tr>
+      <w:tr>
+        <w:tc>
+          <w:tcPr>
+            <w:tcW w:type="dxa" w:w="1500"/>
+            <w:tcBorders>
+              <w:top w:val="single" w:color="CCCCCC" w:sz="1"/>
+              <w:left w:val="single" w:color="CCCCCC" w:sz="1"/>
+              <w:bottom w:val="single" w:color="CCCCCC" w:sz="1"/>
+              <w:right w:val="single" w:color="CCCCCC" w:sz="1"/>
+            </w:tcBorders>
+            <w:shd w:fill="FFFFFF" w:val="clear"/>
+            <w:tcMar>
+              <w:top w:type="dxa" w:w="80"/>
+              <w:left w:type="dxa" w:w="120"/>
+              <w:bottom w:type="dxa" w:w="80"/>
+              <w:right w:type="dxa" w:w="120"/>
+            </w:tcMar>
+          </w:tcPr>
+          <w:p>
+            <w:r>
+              <w:rPr>
+                <w:b w:val="false"/>
+                <w:bCs w:val="false"/>
+                <w:sz w:val="22"/>
+                <w:szCs w:val="22"/>
+              </w:rPr>
+              <w:t xml:space="preserve">3c2e7753</w:t>
+            </w:r>
+          </w:p>
+        </w:tc>
+        <w:tc>
+          <w:tcPr>
+            <w:tcW w:type="dxa" w:w="2800"/>
+            <w:tcBorders>
+              <w:top w:val="single" w:color="CCCCCC" w:sz="1"/>
+              <w:left w:val="single" w:color="CCCCCC" w:sz="1"/>
+              <w:bottom w:val="single" w:color="CCCCCC" w:sz="1"/>
+              <w:right w:val="single" w:color="CCCCCC" w:sz="1"/>
+            </w:tcBorders>
+            <w:shd w:fill="FFFFFF" w:val="clear"/>
+            <w:tcMar>
+              <w:top w:type="dxa" w:w="80"/>
+              <w:left w:type="dxa" w:w="120"/>
+              <w:bottom w:type="dxa" w:w="80"/>
+              <w:right w:type="dxa" w:w="120"/>
+            </w:tcMar>
+          </w:tcPr>
+          <w:p>
+            <w:r>
+              <w:rPr>
+                <w:b w:val="false"/>
+                <w:bCs w:val="false"/>
+                <w:sz w:val="22"/>
+                <w:szCs w:val="22"/>
+              </w:rPr>
+              <w:t xml:space="preserve">Full (Scenario 4B)</w:t>
+            </w:r>
+          </w:p>
+        </w:tc>
+        <w:tc>
+          <w:tcPr>
+            <w:tcW w:type="dxa" w:w="5060"/>
+            <w:tcBorders>
+              <w:top w:val="single" w:color="CCCCCC" w:sz="1"/>
+              <w:left w:val="single" w:color="CCCCCC" w:sz="1"/>
+              <w:bottom w:val="single" w:color="CCCCCC" w:sz="1"/>
+              <w:right w:val="single" w:color="CCCCCC" w:sz="1"/>
+            </w:tcBorders>
+            <w:shd w:fill="FFFFFF" w:val="clear"/>
+            <w:tcMar>
+              <w:top w:type="dxa" w:w="80"/>
+              <w:left w:type="dxa" w:w="120"/>
+              <w:bottom w:type="dxa" w:w="80"/>
+              <w:right w:type="dxa" w:w="120"/>
+            </w:tcMar>
+          </w:tcPr>
+          <w:p>
+            <w:r>
+              <w:rPr>
+                <w:b w:val="false"/>
+                <w:bCs w:val="false"/>
+                <w:sz w:val="22"/>
+                <w:szCs w:val="22"/>
+              </w:rPr>
+              <w:t xml:space="preserve">Sprinklers, Fire Doors, Vents, AI Signage, Wider, Pressurization</w:t>
+            </w:r>
+          </w:p>
+        </w:tc>
+      </w:tr>
+    </w:tbl>
+    <w:p>
+      <w:pPr>
+        <w:spacing w:after="160"/>
+      </w:pPr>
+      <w:r>
+        <w:rPr>
+          <w:sz w:val="24"/>
+          <w:szCs w:val="24"/>
+        </w:rPr>
+        <w:t xml:space="preserve">Table 6.2 — Quantitative Egress &amp; Safety Results:</w:t>
+      </w:r>
+    </w:p>
+    <w:tbl>
+      <w:tblPr>
+        <w:tblW w:type="dxa" w:w="9360"/>
+        <w:tblBorders>
+          <w:top w:val="single" w:color="auto" w:sz="4"/>
+          <w:left w:val="single" w:color="auto" w:sz="4"/>
+          <w:bottom w:val="single" w:color="auto" w:sz="4"/>
+          <w:right w:val="single" w:color="auto" w:sz="4"/>
+          <w:insideH w:val="single" w:color="auto" w:sz="4"/>
+          <w:insideV w:val="single" w:color="auto" w:sz="4"/>
+        </w:tblBorders>
+      </w:tblPr>
+      <w:tblGrid>
+        <w:gridCol w:w="1500"/>
+        <w:gridCol w:w="1800"/>
+        <w:gridCol w:w="1800"/>
+        <w:gridCol w:w="2260"/>
+        <w:gridCol w:w="2000"/>
+      </w:tblGrid>
+      <w:tr>
+        <w:tc>
+          <w:tcPr>
+            <w:tcW w:type="dxa" w:w="1500"/>
+            <w:tcBorders>
+              <w:top w:val="single" w:color="CCCCCC" w:sz="1"/>
+              <w:left w:val="single" w:color="CCCCCC" w:sz="1"/>
+              <w:bottom w:val="single" w:color="CCCCCC" w:sz="1"/>
+              <w:right w:val="single" w:color="CCCCCC" w:sz="1"/>
+            </w:tcBorders>
+            <w:shd w:fill="D5E8F0" w:val="clear"/>
+            <w:tcMar>
+              <w:top w:type="dxa" w:w="80"/>
+              <w:left w:type="dxa" w:w="120"/>
+              <w:bottom w:type="dxa" w:w="80"/>
+              <w:right w:type="dxa" w:w="120"/>
+            </w:tcMar>
+          </w:tcPr>
+          <w:p>
+            <w:r>
+              <w:rPr>
+                <w:b/>
+                <w:bCs/>
+                <w:sz w:val="22"/>
+                <w:szCs w:val="22"/>
+              </w:rPr>
+              <w:t xml:space="preserve">Run ID</w:t>
+            </w:r>
+          </w:p>
+        </w:tc>
+        <w:tc>
+          <w:tcPr>
+            <w:tcW w:type="dxa" w:w="1800"/>
+            <w:tcBorders>
+              <w:top w:val="single" w:color="CCCCCC" w:sz="1"/>
+              <w:left w:val="single" w:color="CCCCCC" w:sz="1"/>
+              <w:bottom w:val="single" w:color="CCCCCC" w:sz="1"/>
+              <w:right w:val="single" w:color="CCCCCC" w:sz="1"/>
+            </w:tcBorders>
+            <w:shd w:fill="D5E8F0" w:val="clear"/>
+            <w:tcMar>
+              <w:top w:type="dxa" w:w="80"/>
+              <w:left w:type="dxa" w:w="120"/>
+              <w:bottom w:type="dxa" w:w="80"/>
+              <w:right w:type="dxa" w:w="120"/>
+            </w:tcMar>
+          </w:tcPr>
+          <w:p>
+            <w:r>
+              <w:rPr>
+                <w:b/>
+                <w:bCs/>
+                <w:sz w:val="22"/>
+                <w:szCs w:val="22"/>
+              </w:rPr>
+              <w:t xml:space="preserve">ASET</w:t>
+            </w:r>
+          </w:p>
+        </w:tc>
+        <w:tc>
+          <w:tcPr>
+            <w:tcW w:type="dxa" w:w="1800"/>
+            <w:tcBorders>
+              <w:top w:val="single" w:color="CCCCCC" w:sz="1"/>
+              <w:left w:val="single" w:color="CCCCCC" w:sz="1"/>
+              <w:bottom w:val="single" w:color="CCCCCC" w:sz="1"/>
+              <w:right w:val="single" w:color="CCCCCC" w:sz="1"/>
+            </w:tcBorders>
+            <w:shd w:fill="D5E8F0" w:val="clear"/>
+            <w:tcMar>
+              <w:top w:type="dxa" w:w="80"/>
+              <w:left w:type="dxa" w:w="120"/>
+              <w:bottom w:type="dxa" w:w="80"/>
+              <w:right w:type="dxa" w:w="120"/>
+            </w:tcMar>
+          </w:tcPr>
+          <w:p>
+            <w:r>
+              <w:rPr>
+                <w:b/>
+                <w:bCs/>
+                <w:sz w:val="22"/>
+                <w:szCs w:val="22"/>
+              </w:rPr>
+              <w:t xml:space="preserve">RSET</w:t>
+            </w:r>
+          </w:p>
+        </w:tc>
+        <w:tc>
+          <w:tcPr>
+            <w:tcW w:type="dxa" w:w="2260"/>
+            <w:tcBorders>
+              <w:top w:val="single" w:color="CCCCCC" w:sz="1"/>
+              <w:left w:val="single" w:color="CCCCCC" w:sz="1"/>
+              <w:bottom w:val="single" w:color="CCCCCC" w:sz="1"/>
+              <w:right w:val="single" w:color="CCCCCC" w:sz="1"/>
+            </w:tcBorders>
+            <w:shd w:fill="D5E8F0" w:val="clear"/>
+            <w:tcMar>
+              <w:top w:type="dxa" w:w="80"/>
+              <w:left w:type="dxa" w:w="120"/>
+              <w:bottom w:type="dxa" w:w="80"/>
+              <w:right w:type="dxa" w:w="120"/>
+            </w:tcMar>
+          </w:tcPr>
+          <w:p>
+            <w:r>
+              <w:rPr>
+                <w:b/>
+                <w:bCs/>
+                <w:sz w:val="22"/>
+                <w:szCs w:val="22"/>
+              </w:rPr>
+              <w:t xml:space="preserve">Safety Margin (ASET - RSET)</w:t>
+            </w:r>
+          </w:p>
+        </w:tc>
+        <w:tc>
+          <w:tcPr>
+            <w:tcW w:type="dxa" w:w="2000"/>
+            <w:tcBorders>
+              <w:top w:val="single" w:color="CCCCCC" w:sz="1"/>
+              <w:left w:val="single" w:color="CCCCCC" w:sz="1"/>
+              <w:bottom w:val="single" w:color="CCCCCC" w:sz="1"/>
+              <w:right w:val="single" w:color="CCCCCC" w:sz="1"/>
+            </w:tcBorders>
+            <w:shd w:fill="D5E8F0" w:val="clear"/>
+            <w:tcMar>
+              <w:top w:type="dxa" w:w="80"/>
+              <w:left w:type="dxa" w:w="120"/>
+              <w:bottom w:type="dxa" w:w="80"/>
+              <w:right w:type="dxa" w:w="120"/>
+            </w:tcMar>
+          </w:tcPr>
+          <w:p>
+            <w:r>
+              <w:rPr>
+                <w:b/>
+                <w:bCs/>
+                <w:sz w:val="22"/>
+                <w:szCs w:val="22"/>
+              </w:rPr>
+              <w:t xml:space="preserve">Casualties</w:t>
+            </w:r>
+          </w:p>
+        </w:tc>
+      </w:tr>
+      <w:tr>
+        <w:tc>
+          <w:tcPr>
+            <w:tcW w:type="dxa" w:w="1500"/>
+            <w:tcBorders>
+              <w:top w:val="single" w:color="CCCCCC" w:sz="1"/>
+              <w:left w:val="single" w:color="CCCCCC" w:sz="1"/>
+              <w:bottom w:val="single" w:color="CCCCCC" w:sz="1"/>
+              <w:right w:val="single" w:color="CCCCCC" w:sz="1"/>
+            </w:tcBorders>
+            <w:shd w:fill="FFFFFF" w:val="clear"/>
+            <w:tcMar>
+              <w:top w:type="dxa" w:w="80"/>
+              <w:left w:type="dxa" w:w="120"/>
+              <w:bottom w:type="dxa" w:w="80"/>
+              <w:right w:type="dxa" w:w="120"/>
+            </w:tcMar>
+          </w:tcPr>
+          <w:p>
+            <w:r>
+              <w:rPr>
+                <w:b w:val="false"/>
+                <w:bCs w:val="false"/>
+                <w:sz w:val="22"/>
+                <w:szCs w:val="22"/>
+              </w:rPr>
+              <w:t xml:space="preserve">8ee3aaa1</w:t>
+            </w:r>
+          </w:p>
+        </w:tc>
+        <w:tc>
+          <w:tcPr>
+            <w:tcW w:type="dxa" w:w="1800"/>
+            <w:tcBorders>
+              <w:top w:val="single" w:color="CCCCCC" w:sz="1"/>
+              <w:left w:val="single" w:color="CCCCCC" w:sz="1"/>
+              <w:bottom w:val="single" w:color="CCCCCC" w:sz="1"/>
+              <w:right w:val="single" w:color="CCCCCC" w:sz="1"/>
+            </w:tcBorders>
+            <w:shd w:fill="FFFFFF" w:val="clear"/>
+            <w:tcMar>
+              <w:top w:type="dxa" w:w="80"/>
+              <w:left w:type="dxa" w:w="120"/>
+              <w:bottom w:type="dxa" w:w="80"/>
+              <w:right w:type="dxa" w:w="120"/>
+            </w:tcMar>
+          </w:tcPr>
+          <w:p>
+            <w:r>
+              <w:rPr>
+                <w:b w:val="false"/>
+                <w:bCs w:val="false"/>
+                <w:sz w:val="22"/>
+                <w:szCs w:val="22"/>
+              </w:rPr>
+              <w:t xml:space="preserve">70 s</w:t>
+            </w:r>
+          </w:p>
+        </w:tc>
+        <w:tc>
+          <w:tcPr>
+            <w:tcW w:type="dxa" w:w="1800"/>
+            <w:tcBorders>
+              <w:top w:val="single" w:color="CCCCCC" w:sz="1"/>
+              <w:left w:val="single" w:color="CCCCCC" w:sz="1"/>
+              <w:bottom w:val="single" w:color="CCCCCC" w:sz="1"/>
+              <w:right w:val="single" w:color="CCCCCC" w:sz="1"/>
+            </w:tcBorders>
+            <w:shd w:fill="FFFFFF" w:val="clear"/>
+            <w:tcMar>
+              <w:top w:type="dxa" w:w="80"/>
+              <w:left w:type="dxa" w:w="120"/>
+              <w:bottom w:type="dxa" w:w="80"/>
+              <w:right w:type="dxa" w:w="120"/>
+            </w:tcMar>
+          </w:tcPr>
+          <w:p>
+            <w:r>
+              <w:rPr>
+                <w:b w:val="false"/>
+                <w:bCs w:val="false"/>
+                <w:sz w:val="22"/>
+                <w:szCs w:val="22"/>
+              </w:rPr>
+              <w:t xml:space="preserve">1133 s</w:t>
+            </w:r>
+          </w:p>
+        </w:tc>
+        <w:tc>
+          <w:tcPr>
+            <w:tcW w:type="dxa" w:w="2260"/>
+            <w:tcBorders>
+              <w:top w:val="single" w:color="CCCCCC" w:sz="1"/>
+              <w:left w:val="single" w:color="CCCCCC" w:sz="1"/>
+              <w:bottom w:val="single" w:color="CCCCCC" w:sz="1"/>
+              <w:right w:val="single" w:color="CCCCCC" w:sz="1"/>
+            </w:tcBorders>
+            <w:shd w:fill="FFFFFF" w:val="clear"/>
+            <w:tcMar>
+              <w:top w:type="dxa" w:w="80"/>
+              <w:left w:type="dxa" w:w="120"/>
+              <w:bottom w:type="dxa" w:w="80"/>
+              <w:right w:type="dxa" w:w="120"/>
+            </w:tcMar>
+          </w:tcPr>
+          <w:p>
+            <w:r>
+              <w:rPr>
+                <w:b w:val="false"/>
+                <w:bCs w:val="false"/>
+                <w:sz w:val="22"/>
+                <w:szCs w:val="22"/>
+              </w:rPr>
+              <w:t xml:space="preserve">-1063 s</w:t>
+            </w:r>
+          </w:p>
+        </w:tc>
+        <w:tc>
+          <w:tcPr>
+            <w:tcW w:type="dxa" w:w="2000"/>
+            <w:tcBorders>
+              <w:top w:val="single" w:color="CCCCCC" w:sz="1"/>
+              <w:left w:val="single" w:color="CCCCCC" w:sz="1"/>
+              <w:bottom w:val="single" w:color="CCCCCC" w:sz="1"/>
+              <w:right w:val="single" w:color="CCCCCC" w:sz="1"/>
+            </w:tcBorders>
+            <w:shd w:fill="FFFFFF" w:val="clear"/>
+            <w:tcMar>
+              <w:top w:type="dxa" w:w="80"/>
+              <w:left w:type="dxa" w:w="120"/>
+              <w:bottom w:type="dxa" w:w="80"/>
+              <w:right w:type="dxa" w:w="120"/>
+            </w:tcMar>
+          </w:tcPr>
+          <w:p>
+            <w:r>
+              <w:rPr>
+                <w:b w:val="false"/>
+                <w:bCs w:val="false"/>
+                <w:sz w:val="22"/>
+                <w:szCs w:val="22"/>
+              </w:rPr>
+              <w:t xml:space="preserve">27 / 60</w:t>
+            </w:r>
+          </w:p>
+        </w:tc>
+      </w:tr>
+      <w:tr>
+        <w:tc>
+          <w:tcPr>
+            <w:tcW w:type="dxa" w:w="1500"/>
+            <w:tcBorders>
+              <w:top w:val="single" w:color="CCCCCC" w:sz="1"/>
+              <w:left w:val="single" w:color="CCCCCC" w:sz="1"/>
+              <w:bottom w:val="single" w:color="CCCCCC" w:sz="1"/>
+              <w:right w:val="single" w:color="CCCCCC" w:sz="1"/>
+            </w:tcBorders>
+            <w:shd w:fill="FFFFFF" w:val="clear"/>
+            <w:tcMar>
+              <w:top w:type="dxa" w:w="80"/>
+              <w:left w:type="dxa" w:w="120"/>
+              <w:bottom w:type="dxa" w:w="80"/>
+              <w:right w:type="dxa" w:w="120"/>
+            </w:tcMar>
+          </w:tcPr>
+          <w:p>
+            <w:r>
+              <w:rPr>
+                <w:b w:val="false"/>
+                <w:bCs w:val="false"/>
+                <w:sz w:val="22"/>
+                <w:szCs w:val="22"/>
+              </w:rPr>
+              <w:t xml:space="preserve">9ca65484</w:t>
+            </w:r>
+          </w:p>
+        </w:tc>
+        <w:tc>
+          <w:tcPr>
+            <w:tcW w:type="dxa" w:w="1800"/>
+            <w:tcBorders>
+              <w:top w:val="single" w:color="CCCCCC" w:sz="1"/>
+              <w:left w:val="single" w:color="CCCCCC" w:sz="1"/>
+              <w:bottom w:val="single" w:color="CCCCCC" w:sz="1"/>
+              <w:right w:val="single" w:color="CCCCCC" w:sz="1"/>
+            </w:tcBorders>
+            <w:shd w:fill="FFFFFF" w:val="clear"/>
+            <w:tcMar>
+              <w:top w:type="dxa" w:w="80"/>
+              <w:left w:type="dxa" w:w="120"/>
+              <w:bottom w:type="dxa" w:w="80"/>
+              <w:right w:type="dxa" w:w="120"/>
+            </w:tcMar>
+          </w:tcPr>
+          <w:p>
+            <w:r>
+              <w:rPr>
+                <w:b w:val="false"/>
+                <w:bCs w:val="false"/>
+                <w:sz w:val="22"/>
+                <w:szCs w:val="22"/>
+              </w:rPr>
+              <w:t xml:space="preserve">70 s</w:t>
+            </w:r>
+          </w:p>
+        </w:tc>
+        <w:tc>
+          <w:tcPr>
+            <w:tcW w:type="dxa" w:w="1800"/>
+            <w:tcBorders>
+              <w:top w:val="single" w:color="CCCCCC" w:sz="1"/>
+              <w:left w:val="single" w:color="CCCCCC" w:sz="1"/>
+              <w:bottom w:val="single" w:color="CCCCCC" w:sz="1"/>
+              <w:right w:val="single" w:color="CCCCCC" w:sz="1"/>
+            </w:tcBorders>
+            <w:shd w:fill="FFFFFF" w:val="clear"/>
+            <w:tcMar>
+              <w:top w:type="dxa" w:w="80"/>
+              <w:left w:type="dxa" w:w="120"/>
+              <w:bottom w:type="dxa" w:w="80"/>
+              <w:right w:type="dxa" w:w="120"/>
+            </w:tcMar>
+          </w:tcPr>
+          <w:p>
+            <w:r>
+              <w:rPr>
+                <w:b w:val="false"/>
+                <w:bCs w:val="false"/>
+                <w:sz w:val="22"/>
+                <w:szCs w:val="22"/>
+              </w:rPr>
+              <w:t xml:space="preserve">1200 s</w:t>
+            </w:r>
+          </w:p>
+        </w:tc>
+        <w:tc>
+          <w:tcPr>
+            <w:tcW w:type="dxa" w:w="2260"/>
+            <w:tcBorders>
+              <w:top w:val="single" w:color="CCCCCC" w:sz="1"/>
+              <w:left w:val="single" w:color="CCCCCC" w:sz="1"/>
+              <w:bottom w:val="single" w:color="CCCCCC" w:sz="1"/>
+              <w:right w:val="single" w:color="CCCCCC" w:sz="1"/>
+            </w:tcBorders>
+            <w:shd w:fill="FFFFFF" w:val="clear"/>
+            <w:tcMar>
+              <w:top w:type="dxa" w:w="80"/>
+              <w:left w:type="dxa" w:w="120"/>
+              <w:bottom w:type="dxa" w:w="80"/>
+              <w:right w:type="dxa" w:w="120"/>
+            </w:tcMar>
+          </w:tcPr>
+          <w:p>
+            <w:r>
+              <w:rPr>
+                <w:b w:val="false"/>
+                <w:bCs w:val="false"/>
+                <w:sz w:val="22"/>
+                <w:szCs w:val="22"/>
+              </w:rPr>
+              <w:t xml:space="preserve">-1130 s</w:t>
+            </w:r>
+          </w:p>
+        </w:tc>
+        <w:tc>
+          <w:tcPr>
+            <w:tcW w:type="dxa" w:w="2000"/>
+            <w:tcBorders>
+              <w:top w:val="single" w:color="CCCCCC" w:sz="1"/>
+              <w:left w:val="single" w:color="CCCCCC" w:sz="1"/>
+              <w:bottom w:val="single" w:color="CCCCCC" w:sz="1"/>
+              <w:right w:val="single" w:color="CCCCCC" w:sz="1"/>
+            </w:tcBorders>
+            <w:shd w:fill="FFFFFF" w:val="clear"/>
+            <w:tcMar>
+              <w:top w:type="dxa" w:w="80"/>
+              <w:left w:type="dxa" w:w="120"/>
+              <w:bottom w:type="dxa" w:w="80"/>
+              <w:right w:type="dxa" w:w="120"/>
+            </w:tcMar>
+          </w:tcPr>
+          <w:p>
+            <w:r>
+              <w:rPr>
+                <w:b w:val="false"/>
+                <w:bCs w:val="false"/>
+                <w:sz w:val="22"/>
+                <w:szCs w:val="22"/>
+              </w:rPr>
+              <w:t xml:space="preserve">22 / 60</w:t>
+            </w:r>
+          </w:p>
+        </w:tc>
+      </w:tr>
+      <w:tr>
+        <w:tc>
+          <w:tcPr>
+            <w:tcW w:type="dxa" w:w="1500"/>
+            <w:tcBorders>
+              <w:top w:val="single" w:color="CCCCCC" w:sz="1"/>
+              <w:left w:val="single" w:color="CCCCCC" w:sz="1"/>
+              <w:bottom w:val="single" w:color="CCCCCC" w:sz="1"/>
+              <w:right w:val="single" w:color="CCCCCC" w:sz="1"/>
+            </w:tcBorders>
+            <w:shd w:fill="FFFFFF" w:val="clear"/>
+            <w:tcMar>
+              <w:top w:type="dxa" w:w="80"/>
+              <w:left w:type="dxa" w:w="120"/>
+              <w:bottom w:type="dxa" w:w="80"/>
+              <w:right w:type="dxa" w:w="120"/>
+            </w:tcMar>
+          </w:tcPr>
+          <w:p>
+            <w:r>
+              <w:rPr>
+                <w:b w:val="false"/>
+                <w:bCs w:val="false"/>
+                <w:sz w:val="22"/>
+                <w:szCs w:val="22"/>
+              </w:rPr>
+              <w:t xml:space="preserve">678383ec</w:t>
+            </w:r>
+          </w:p>
+        </w:tc>
+        <w:tc>
+          <w:tcPr>
+            <w:tcW w:type="dxa" w:w="1800"/>
+            <w:tcBorders>
+              <w:top w:val="single" w:color="CCCCCC" w:sz="1"/>
+              <w:left w:val="single" w:color="CCCCCC" w:sz="1"/>
+              <w:bottom w:val="single" w:color="CCCCCC" w:sz="1"/>
+              <w:right w:val="single" w:color="CCCCCC" w:sz="1"/>
+            </w:tcBorders>
+            <w:shd w:fill="FFFFFF" w:val="clear"/>
+            <w:tcMar>
+              <w:top w:type="dxa" w:w="80"/>
+              <w:left w:type="dxa" w:w="120"/>
+              <w:bottom w:type="dxa" w:w="80"/>
+              <w:right w:type="dxa" w:w="120"/>
+            </w:tcMar>
+          </w:tcPr>
+          <w:p>
+            <w:r>
+              <w:rPr>
+                <w:b w:val="false"/>
+                <w:bCs w:val="false"/>
+                <w:sz w:val="22"/>
+                <w:szCs w:val="22"/>
+              </w:rPr>
+              <w:t xml:space="preserve">80 s</w:t>
+            </w:r>
+          </w:p>
+        </w:tc>
+        <w:tc>
+          <w:tcPr>
+            <w:tcW w:type="dxa" w:w="1800"/>
+            <w:tcBorders>
+              <w:top w:val="single" w:color="CCCCCC" w:sz="1"/>
+              <w:left w:val="single" w:color="CCCCCC" w:sz="1"/>
+              <w:bottom w:val="single" w:color="CCCCCC" w:sz="1"/>
+              <w:right w:val="single" w:color="CCCCCC" w:sz="1"/>
+            </w:tcBorders>
+            <w:shd w:fill="FFFFFF" w:val="clear"/>
+            <w:tcMar>
+              <w:top w:type="dxa" w:w="80"/>
+              <w:left w:type="dxa" w:w="120"/>
+              <w:bottom w:type="dxa" w:w="80"/>
+              <w:right w:type="dxa" w:w="120"/>
+            </w:tcMar>
+          </w:tcPr>
+          <w:p>
+            <w:r>
+              <w:rPr>
+                <w:b w:val="false"/>
+                <w:bCs w:val="false"/>
+                <w:sz w:val="22"/>
+                <w:szCs w:val="22"/>
+              </w:rPr>
+              <w:t xml:space="preserve">1200 s</w:t>
+            </w:r>
+          </w:p>
+        </w:tc>
+        <w:tc>
+          <w:tcPr>
+            <w:tcW w:type="dxa" w:w="2260"/>
+            <w:tcBorders>
+              <w:top w:val="single" w:color="CCCCCC" w:sz="1"/>
+              <w:left w:val="single" w:color="CCCCCC" w:sz="1"/>
+              <w:bottom w:val="single" w:color="CCCCCC" w:sz="1"/>
+              <w:right w:val="single" w:color="CCCCCC" w:sz="1"/>
+            </w:tcBorders>
+            <w:shd w:fill="FFFFFF" w:val="clear"/>
+            <w:tcMar>
+              <w:top w:type="dxa" w:w="80"/>
+              <w:left w:type="dxa" w:w="120"/>
+              <w:bottom w:type="dxa" w:w="80"/>
+              <w:right w:type="dxa" w:w="120"/>
+            </w:tcMar>
+          </w:tcPr>
+          <w:p>
+            <w:r>
+              <w:rPr>
+                <w:b w:val="false"/>
+                <w:bCs w:val="false"/>
+                <w:sz w:val="22"/>
+                <w:szCs w:val="22"/>
+              </w:rPr>
+              <w:t xml:space="preserve">-1120 s</w:t>
+            </w:r>
+          </w:p>
+        </w:tc>
+        <w:tc>
+          <w:tcPr>
+            <w:tcW w:type="dxa" w:w="2000"/>
+            <w:tcBorders>
+              <w:top w:val="single" w:color="CCCCCC" w:sz="1"/>
+              <w:left w:val="single" w:color="CCCCCC" w:sz="1"/>
+              <w:bottom w:val="single" w:color="CCCCCC" w:sz="1"/>
+              <w:right w:val="single" w:color="CCCCCC" w:sz="1"/>
+            </w:tcBorders>
+            <w:shd w:fill="FFFFFF" w:val="clear"/>
+            <w:tcMar>
+              <w:top w:type="dxa" w:w="80"/>
+              <w:left w:type="dxa" w:w="120"/>
+              <w:bottom w:type="dxa" w:w="80"/>
+              <w:right w:type="dxa" w:w="120"/>
+            </w:tcMar>
+          </w:tcPr>
+          <w:p>
+            <w:r>
+              <w:rPr>
+                <w:b w:val="false"/>
+                <w:bCs w:val="false"/>
+                <w:sz w:val="22"/>
+                <w:szCs w:val="22"/>
+              </w:rPr>
+              <w:t xml:space="preserve">2 / 60</w:t>
+            </w:r>
+          </w:p>
+        </w:tc>
+      </w:tr>
+      <w:tr>
+        <w:tc>
+          <w:tcPr>
+            <w:tcW w:type="dxa" w:w="1500"/>
+            <w:tcBorders>
+              <w:top w:val="single" w:color="CCCCCC" w:sz="1"/>
+              <w:left w:val="single" w:color="CCCCCC" w:sz="1"/>
+              <w:bottom w:val="single" w:color="CCCCCC" w:sz="1"/>
+              <w:right w:val="single" w:color="CCCCCC" w:sz="1"/>
+            </w:tcBorders>
+            <w:shd w:fill="FFFFFF" w:val="clear"/>
+            <w:tcMar>
+              <w:top w:type="dxa" w:w="80"/>
+              <w:left w:type="dxa" w:w="120"/>
+              <w:bottom w:type="dxa" w:w="80"/>
+              <w:right w:type="dxa" w:w="120"/>
+            </w:tcMar>
+          </w:tcPr>
+          <w:p>
+            <w:r>
+              <w:rPr>
+                <w:b w:val="false"/>
+                <w:bCs w:val="false"/>
+                <w:sz w:val="22"/>
+                <w:szCs w:val="22"/>
+              </w:rPr>
+              <w:t xml:space="preserve">be143ae9</w:t>
+            </w:r>
+          </w:p>
+        </w:tc>
+        <w:tc>
+          <w:tcPr>
+            <w:tcW w:type="dxa" w:w="1800"/>
+            <w:tcBorders>
+              <w:top w:val="single" w:color="CCCCCC" w:sz="1"/>
+              <w:left w:val="single" w:color="CCCCCC" w:sz="1"/>
+              <w:bottom w:val="single" w:color="CCCCCC" w:sz="1"/>
+              <w:right w:val="single" w:color="CCCCCC" w:sz="1"/>
+            </w:tcBorders>
+            <w:shd w:fill="FFFFFF" w:val="clear"/>
+            <w:tcMar>
+              <w:top w:type="dxa" w:w="80"/>
+              <w:left w:type="dxa" w:w="120"/>
+              <w:bottom w:type="dxa" w:w="80"/>
+              <w:right w:type="dxa" w:w="120"/>
+            </w:tcMar>
+          </w:tcPr>
+          <w:p>
+            <w:r>
+              <w:rPr>
+                <w:b w:val="false"/>
+                <w:bCs w:val="false"/>
+                <w:sz w:val="22"/>
+                <w:szCs w:val="22"/>
+              </w:rPr>
+              <w:t xml:space="preserve">80 s</w:t>
+            </w:r>
+          </w:p>
+        </w:tc>
+        <w:tc>
+          <w:tcPr>
+            <w:tcW w:type="dxa" w:w="1800"/>
+            <w:tcBorders>
+              <w:top w:val="single" w:color="CCCCCC" w:sz="1"/>
+              <w:left w:val="single" w:color="CCCCCC" w:sz="1"/>
+              <w:bottom w:val="single" w:color="CCCCCC" w:sz="1"/>
+              <w:right w:val="single" w:color="CCCCCC" w:sz="1"/>
+            </w:tcBorders>
+            <w:shd w:fill="FFFFFF" w:val="clear"/>
+            <w:tcMar>
+              <w:top w:type="dxa" w:w="80"/>
+              <w:left w:type="dxa" w:w="120"/>
+              <w:bottom w:type="dxa" w:w="80"/>
+              <w:right w:type="dxa" w:w="120"/>
+            </w:tcMar>
+          </w:tcPr>
+          <w:p>
+            <w:r>
+              <w:rPr>
+                <w:b w:val="false"/>
+                <w:bCs w:val="false"/>
+                <w:sz w:val="22"/>
+                <w:szCs w:val="22"/>
+              </w:rPr>
+              <w:t xml:space="preserve">1200 s</w:t>
+            </w:r>
+          </w:p>
+        </w:tc>
+        <w:tc>
+          <w:tcPr>
+            <w:tcW w:type="dxa" w:w="2260"/>
+            <w:tcBorders>
+              <w:top w:val="single" w:color="CCCCCC" w:sz="1"/>
+              <w:left w:val="single" w:color="CCCCCC" w:sz="1"/>
+              <w:bottom w:val="single" w:color="CCCCCC" w:sz="1"/>
+              <w:right w:val="single" w:color="CCCCCC" w:sz="1"/>
+            </w:tcBorders>
+            <w:shd w:fill="FFFFFF" w:val="clear"/>
+            <w:tcMar>
+              <w:top w:type="dxa" w:w="80"/>
+              <w:left w:type="dxa" w:w="120"/>
+              <w:bottom w:type="dxa" w:w="80"/>
+              <w:right w:type="dxa" w:w="120"/>
+            </w:tcMar>
+          </w:tcPr>
+          <w:p>
+            <w:r>
+              <w:rPr>
+                <w:b w:val="false"/>
+                <w:bCs w:val="false"/>
+                <w:sz w:val="22"/>
+                <w:szCs w:val="22"/>
+              </w:rPr>
+              <w:t xml:space="preserve">-1120 s</w:t>
+            </w:r>
+          </w:p>
+        </w:tc>
+        <w:tc>
+          <w:tcPr>
+            <w:tcW w:type="dxa" w:w="2000"/>
+            <w:tcBorders>
+              <w:top w:val="single" w:color="CCCCCC" w:sz="1"/>
+              <w:left w:val="single" w:color="CCCCCC" w:sz="1"/>
+              <w:bottom w:val="single" w:color="CCCCCC" w:sz="1"/>
+              <w:right w:val="single" w:color="CCCCCC" w:sz="1"/>
+            </w:tcBorders>
+            <w:shd w:fill="FFFFFF" w:val="clear"/>
+            <w:tcMar>
+              <w:top w:type="dxa" w:w="80"/>
+              <w:left w:type="dxa" w:w="120"/>
+              <w:bottom w:type="dxa" w:w="80"/>
+              <w:right w:type="dxa" w:w="120"/>
+            </w:tcMar>
+          </w:tcPr>
+          <w:p>
+            <w:r>
+              <w:rPr>
+                <w:b w:val="false"/>
+                <w:bCs w:val="false"/>
+                <w:sz w:val="22"/>
+                <w:szCs w:val="22"/>
+              </w:rPr>
+              <w:t xml:space="preserve">6 / 60</w:t>
+            </w:r>
+          </w:p>
+        </w:tc>
+      </w:tr>
+      <w:tr>
+        <w:tc>
+          <w:tcPr>
+            <w:tcW w:type="dxa" w:w="1500"/>
+            <w:tcBorders>
+              <w:top w:val="single" w:color="CCCCCC" w:sz="1"/>
+              <w:left w:val="single" w:color="CCCCCC" w:sz="1"/>
+              <w:bottom w:val="single" w:color="CCCCCC" w:sz="1"/>
+              <w:right w:val="single" w:color="CCCCCC" w:sz="1"/>
+            </w:tcBorders>
+            <w:shd w:fill="FFFFFF" w:val="clear"/>
+            <w:tcMar>
+              <w:top w:type="dxa" w:w="80"/>
+              <w:left w:type="dxa" w:w="120"/>
+              <w:bottom w:type="dxa" w:w="80"/>
+              <w:right w:type="dxa" w:w="120"/>
+            </w:tcMar>
+          </w:tcPr>
+          <w:p>
+            <w:r>
+              <w:rPr>
+                <w:b w:val="false"/>
+                <w:bCs w:val="false"/>
+                <w:sz w:val="22"/>
+                <w:szCs w:val="22"/>
+              </w:rPr>
+              <w:t xml:space="preserve">cbc849af</w:t>
+            </w:r>
+          </w:p>
+        </w:tc>
+        <w:tc>
+          <w:tcPr>
+            <w:tcW w:type="dxa" w:w="1800"/>
+            <w:tcBorders>
+              <w:top w:val="single" w:color="CCCCCC" w:sz="1"/>
+              <w:left w:val="single" w:color="CCCCCC" w:sz="1"/>
+              <w:bottom w:val="single" w:color="CCCCCC" w:sz="1"/>
+              <w:right w:val="single" w:color="CCCCCC" w:sz="1"/>
+            </w:tcBorders>
+            <w:shd w:fill="FFFFFF" w:val="clear"/>
+            <w:tcMar>
+              <w:top w:type="dxa" w:w="80"/>
+              <w:left w:type="dxa" w:w="120"/>
+              <w:bottom w:type="dxa" w:w="80"/>
+              <w:right w:type="dxa" w:w="120"/>
+            </w:tcMar>
+          </w:tcPr>
+          <w:p>
+            <w:r>
+              <w:rPr>
+                <w:b w:val="false"/>
+                <w:bCs w:val="false"/>
+                <w:sz w:val="22"/>
+                <w:szCs w:val="22"/>
+              </w:rPr>
+              <w:t xml:space="preserve">80 s</w:t>
+            </w:r>
+          </w:p>
+        </w:tc>
+        <w:tc>
+          <w:tcPr>
+            <w:tcW w:type="dxa" w:w="1800"/>
+            <w:tcBorders>
+              <w:top w:val="single" w:color="CCCCCC" w:sz="1"/>
+              <w:left w:val="single" w:color="CCCCCC" w:sz="1"/>
+              <w:bottom w:val="single" w:color="CCCCCC" w:sz="1"/>
+              <w:right w:val="single" w:color="CCCCCC" w:sz="1"/>
+            </w:tcBorders>
+            <w:shd w:fill="FFFFFF" w:val="clear"/>
+            <w:tcMar>
+              <w:top w:type="dxa" w:w="80"/>
+              <w:left w:type="dxa" w:w="120"/>
+              <w:bottom w:type="dxa" w:w="80"/>
+              <w:right w:type="dxa" w:w="120"/>
+            </w:tcMar>
+          </w:tcPr>
+          <w:p>
+            <w:r>
+              <w:rPr>
+                <w:b w:val="false"/>
+                <w:bCs w:val="false"/>
+                <w:sz w:val="22"/>
+                <w:szCs w:val="22"/>
+              </w:rPr>
+              <w:t xml:space="preserve">1200 s</w:t>
+            </w:r>
+          </w:p>
+        </w:tc>
+        <w:tc>
+          <w:tcPr>
+            <w:tcW w:type="dxa" w:w="2260"/>
+            <w:tcBorders>
+              <w:top w:val="single" w:color="CCCCCC" w:sz="1"/>
+              <w:left w:val="single" w:color="CCCCCC" w:sz="1"/>
+              <w:bottom w:val="single" w:color="CCCCCC" w:sz="1"/>
+              <w:right w:val="single" w:color="CCCCCC" w:sz="1"/>
+            </w:tcBorders>
+            <w:shd w:fill="FFFFFF" w:val="clear"/>
+            <w:tcMar>
+              <w:top w:type="dxa" w:w="80"/>
+              <w:left w:type="dxa" w:w="120"/>
+              <w:bottom w:type="dxa" w:w="80"/>
+              <w:right w:type="dxa" w:w="120"/>
+            </w:tcMar>
+          </w:tcPr>
+          <w:p>
+            <w:r>
+              <w:rPr>
+                <w:b w:val="false"/>
+                <w:bCs w:val="false"/>
+                <w:sz w:val="22"/>
+                <w:szCs w:val="22"/>
+              </w:rPr>
+              <w:t xml:space="preserve">-1120 s</w:t>
+            </w:r>
+          </w:p>
+        </w:tc>
+        <w:tc>
+          <w:tcPr>
+            <w:tcW w:type="dxa" w:w="2000"/>
+            <w:tcBorders>
+              <w:top w:val="single" w:color="CCCCCC" w:sz="1"/>
+              <w:left w:val="single" w:color="CCCCCC" w:sz="1"/>
+              <w:bottom w:val="single" w:color="CCCCCC" w:sz="1"/>
+              <w:right w:val="single" w:color="CCCCCC" w:sz="1"/>
+            </w:tcBorders>
+            <w:shd w:fill="FFFFFF" w:val="clear"/>
+            <w:tcMar>
+              <w:top w:type="dxa" w:w="80"/>
+              <w:left w:type="dxa" w:w="120"/>
+              <w:bottom w:type="dxa" w:w="80"/>
+              <w:right w:type="dxa" w:w="120"/>
+            </w:tcMar>
+          </w:tcPr>
+          <w:p>
+            <w:r>
+              <w:rPr>
+                <w:b w:val="false"/>
+                <w:bCs w:val="false"/>
+                <w:sz w:val="22"/>
+                <w:szCs w:val="22"/>
+              </w:rPr>
+              <w:t xml:space="preserve">3 / 60</w:t>
+            </w:r>
+          </w:p>
+        </w:tc>
+      </w:tr>
+      <w:tr>
+        <w:tc>
+          <w:tcPr>
+            <w:tcW w:type="dxa" w:w="1500"/>
+            <w:tcBorders>
+              <w:top w:val="single" w:color="CCCCCC" w:sz="1"/>
+              <w:left w:val="single" w:color="CCCCCC" w:sz="1"/>
+              <w:bottom w:val="single" w:color="CCCCCC" w:sz="1"/>
+              <w:right w:val="single" w:color="CCCCCC" w:sz="1"/>
+            </w:tcBorders>
+            <w:shd w:fill="FFFFFF" w:val="clear"/>
+            <w:tcMar>
+              <w:top w:type="dxa" w:w="80"/>
+              <w:left w:type="dxa" w:w="120"/>
+              <w:bottom w:type="dxa" w:w="80"/>
+              <w:right w:type="dxa" w:w="120"/>
+            </w:tcMar>
+          </w:tcPr>
+          <w:p>
+            <w:r>
+              <w:rPr>
+                <w:b w:val="false"/>
+                <w:bCs w:val="false"/>
+                <w:sz w:val="22"/>
+                <w:szCs w:val="22"/>
+              </w:rPr>
+              <w:t xml:space="preserve">768ada18</w:t>
+            </w:r>
+          </w:p>
+        </w:tc>
+        <w:tc>
+          <w:tcPr>
+            <w:tcW w:type="dxa" w:w="1800"/>
+            <w:tcBorders>
+              <w:top w:val="single" w:color="CCCCCC" w:sz="1"/>
+              <w:left w:val="single" w:color="CCCCCC" w:sz="1"/>
+              <w:bottom w:val="single" w:color="CCCCCC" w:sz="1"/>
+              <w:right w:val="single" w:color="CCCCCC" w:sz="1"/>
+            </w:tcBorders>
+            <w:shd w:fill="FFFFFF" w:val="clear"/>
+            <w:tcMar>
+              <w:top w:type="dxa" w:w="80"/>
+              <w:left w:type="dxa" w:w="120"/>
+              <w:bottom w:type="dxa" w:w="80"/>
+              <w:right w:type="dxa" w:w="120"/>
+            </w:tcMar>
+          </w:tcPr>
+          <w:p>
+            <w:r>
+              <w:rPr>
+                <w:b w:val="false"/>
+                <w:bCs w:val="false"/>
+                <w:sz w:val="22"/>
+                <w:szCs w:val="22"/>
+              </w:rPr>
+              <w:t xml:space="preserve">120 s</w:t>
+            </w:r>
+          </w:p>
+        </w:tc>
+        <w:tc>
+          <w:tcPr>
+            <w:tcW w:type="dxa" w:w="1800"/>
+            <w:tcBorders>
+              <w:top w:val="single" w:color="CCCCCC" w:sz="1"/>
+              <w:left w:val="single" w:color="CCCCCC" w:sz="1"/>
+              <w:bottom w:val="single" w:color="CCCCCC" w:sz="1"/>
+              <w:right w:val="single" w:color="CCCCCC" w:sz="1"/>
+            </w:tcBorders>
+            <w:shd w:fill="FFFFFF" w:val="clear"/>
+            <w:tcMar>
+              <w:top w:type="dxa" w:w="80"/>
+              <w:left w:type="dxa" w:w="120"/>
+              <w:bottom w:type="dxa" w:w="80"/>
+              <w:right w:type="dxa" w:w="120"/>
+            </w:tcMar>
+          </w:tcPr>
+          <w:p>
+            <w:r>
+              <w:rPr>
+                <w:b w:val="false"/>
+                <w:bCs w:val="false"/>
+                <w:sz w:val="22"/>
+                <w:szCs w:val="22"/>
+              </w:rPr>
+              <w:t xml:space="preserve">1200 s</w:t>
+            </w:r>
+          </w:p>
+        </w:tc>
+        <w:tc>
+          <w:tcPr>
+            <w:tcW w:type="dxa" w:w="2260"/>
+            <w:tcBorders>
+              <w:top w:val="single" w:color="CCCCCC" w:sz="1"/>
+              <w:left w:val="single" w:color="CCCCCC" w:sz="1"/>
+              <w:bottom w:val="single" w:color="CCCCCC" w:sz="1"/>
+              <w:right w:val="single" w:color="CCCCCC" w:sz="1"/>
+            </w:tcBorders>
+            <w:shd w:fill="FFFFFF" w:val="clear"/>
+            <w:tcMar>
+              <w:top w:type="dxa" w:w="80"/>
+              <w:left w:type="dxa" w:w="120"/>
+              <w:bottom w:type="dxa" w:w="80"/>
+              <w:right w:type="dxa" w:w="120"/>
+            </w:tcMar>
+          </w:tcPr>
+          <w:p>
+            <w:r>
+              <w:rPr>
+                <w:b w:val="false"/>
+                <w:bCs w:val="false"/>
+                <w:sz w:val="22"/>
+                <w:szCs w:val="22"/>
+              </w:rPr>
+              <w:t xml:space="preserve">-1080 s</w:t>
+            </w:r>
+          </w:p>
+        </w:tc>
+        <w:tc>
+          <w:tcPr>
+            <w:tcW w:type="dxa" w:w="2000"/>
+            <w:tcBorders>
+              <w:top w:val="single" w:color="CCCCCC" w:sz="1"/>
+              <w:left w:val="single" w:color="CCCCCC" w:sz="1"/>
+              <w:bottom w:val="single" w:color="CCCCCC" w:sz="1"/>
+              <w:right w:val="single" w:color="CCCCCC" w:sz="1"/>
+            </w:tcBorders>
+            <w:shd w:fill="FFFFFF" w:val="clear"/>
+            <w:tcMar>
+              <w:top w:type="dxa" w:w="80"/>
+              <w:left w:type="dxa" w:w="120"/>
+              <w:bottom w:type="dxa" w:w="80"/>
+              <w:right w:type="dxa" w:w="120"/>
+            </w:tcMar>
+          </w:tcPr>
+          <w:p>
+            <w:r>
+              <w:rPr>
+                <w:b w:val="false"/>
+                <w:bCs w:val="false"/>
+                <w:sz w:val="22"/>
+                <w:szCs w:val="22"/>
+              </w:rPr>
+              <w:t xml:space="preserve">0 / 60</w:t>
+            </w:r>
+          </w:p>
+        </w:tc>
+      </w:tr>
+      <w:tr>
+        <w:tc>
+          <w:tcPr>
+            <w:tcW w:type="dxa" w:w="1500"/>
+            <w:tcBorders>
+              <w:top w:val="single" w:color="CCCCCC" w:sz="1"/>
+              <w:left w:val="single" w:color="CCCCCC" w:sz="1"/>
+              <w:bottom w:val="single" w:color="CCCCCC" w:sz="1"/>
+              <w:right w:val="single" w:color="CCCCCC" w:sz="1"/>
+            </w:tcBorders>
+            <w:shd w:fill="FFFFFF" w:val="clear"/>
+            <w:tcMar>
+              <w:top w:type="dxa" w:w="80"/>
+              <w:left w:type="dxa" w:w="120"/>
+              <w:bottom w:type="dxa" w:w="80"/>
+              <w:right w:type="dxa" w:w="120"/>
+            </w:tcMar>
+          </w:tcPr>
+          <w:p>
+            <w:r>
+              <w:rPr>
+                <w:b w:val="false"/>
+                <w:bCs w:val="false"/>
+                <w:sz w:val="22"/>
+                <w:szCs w:val="22"/>
+              </w:rPr>
+              <w:t xml:space="preserve">ecdebaec</w:t>
+            </w:r>
+          </w:p>
+        </w:tc>
+        <w:tc>
+          <w:tcPr>
+            <w:tcW w:type="dxa" w:w="1800"/>
+            <w:tcBorders>
+              <w:top w:val="single" w:color="CCCCCC" w:sz="1"/>
+              <w:left w:val="single" w:color="CCCCCC" w:sz="1"/>
+              <w:bottom w:val="single" w:color="CCCCCC" w:sz="1"/>
+              <w:right w:val="single" w:color="CCCCCC" w:sz="1"/>
+            </w:tcBorders>
+            <w:shd w:fill="FFFFFF" w:val="clear"/>
+            <w:tcMar>
+              <w:top w:type="dxa" w:w="80"/>
+              <w:left w:type="dxa" w:w="120"/>
+              <w:bottom w:type="dxa" w:w="80"/>
+              <w:right w:type="dxa" w:w="120"/>
+            </w:tcMar>
+          </w:tcPr>
+          <w:p>
+            <w:r>
+              <w:rPr>
+                <w:b w:val="false"/>
+                <w:bCs w:val="false"/>
+                <w:sz w:val="22"/>
+                <w:szCs w:val="22"/>
+              </w:rPr>
+              <w:t xml:space="preserve">120 s</w:t>
+            </w:r>
+          </w:p>
+        </w:tc>
+        <w:tc>
+          <w:tcPr>
+            <w:tcW w:type="dxa" w:w="1800"/>
+            <w:tcBorders>
+              <w:top w:val="single" w:color="CCCCCC" w:sz="1"/>
+              <w:left w:val="single" w:color="CCCCCC" w:sz="1"/>
+              <w:bottom w:val="single" w:color="CCCCCC" w:sz="1"/>
+              <w:right w:val="single" w:color="CCCCCC" w:sz="1"/>
+            </w:tcBorders>
+            <w:shd w:fill="FFFFFF" w:val="clear"/>
+            <w:tcMar>
+              <w:top w:type="dxa" w:w="80"/>
+              <w:left w:type="dxa" w:w="120"/>
+              <w:bottom w:type="dxa" w:w="80"/>
+              <w:right w:type="dxa" w:w="120"/>
+            </w:tcMar>
+          </w:tcPr>
+          <w:p>
+            <w:r>
+              <w:rPr>
+                <w:b w:val="false"/>
+                <w:bCs w:val="false"/>
+                <w:sz w:val="22"/>
+                <w:szCs w:val="22"/>
+              </w:rPr>
+              <w:t xml:space="preserve">1200 s</w:t>
+            </w:r>
+          </w:p>
+        </w:tc>
+        <w:tc>
+          <w:tcPr>
+            <w:tcW w:type="dxa" w:w="2260"/>
+            <w:tcBorders>
+              <w:top w:val="single" w:color="CCCCCC" w:sz="1"/>
+              <w:left w:val="single" w:color="CCCCCC" w:sz="1"/>
+              <w:bottom w:val="single" w:color="CCCCCC" w:sz="1"/>
+              <w:right w:val="single" w:color="CCCCCC" w:sz="1"/>
+            </w:tcBorders>
+            <w:shd w:fill="FFFFFF" w:val="clear"/>
+            <w:tcMar>
+              <w:top w:type="dxa" w:w="80"/>
+              <w:left w:type="dxa" w:w="120"/>
+              <w:bottom w:type="dxa" w:w="80"/>
+              <w:right w:type="dxa" w:w="120"/>
+            </w:tcMar>
+          </w:tcPr>
+          <w:p>
+            <w:r>
+              <w:rPr>
+                <w:b w:val="false"/>
+                <w:bCs w:val="false"/>
+                <w:sz w:val="22"/>
+                <w:szCs w:val="22"/>
+              </w:rPr>
+              <w:t xml:space="preserve">-1080 s</w:t>
+            </w:r>
+          </w:p>
+        </w:tc>
+        <w:tc>
+          <w:tcPr>
+            <w:tcW w:type="dxa" w:w="2000"/>
+            <w:tcBorders>
+              <w:top w:val="single" w:color="CCCCCC" w:sz="1"/>
+              <w:left w:val="single" w:color="CCCCCC" w:sz="1"/>
+              <w:bottom w:val="single" w:color="CCCCCC" w:sz="1"/>
+              <w:right w:val="single" w:color="CCCCCC" w:sz="1"/>
+            </w:tcBorders>
+            <w:shd w:fill="FFFFFF" w:val="clear"/>
+            <w:tcMar>
+              <w:top w:type="dxa" w:w="80"/>
+              <w:left w:type="dxa" w:w="120"/>
+              <w:bottom w:type="dxa" w:w="80"/>
+              <w:right w:type="dxa" w:w="120"/>
+            </w:tcMar>
+          </w:tcPr>
+          <w:p>
+            <w:r>
+              <w:rPr>
+                <w:b w:val="false"/>
+                <w:bCs w:val="false"/>
+                <w:sz w:val="22"/>
+                <w:szCs w:val="22"/>
+              </w:rPr>
+              <w:t xml:space="preserve">0 / 60</w:t>
+            </w:r>
+          </w:p>
+        </w:tc>
+      </w:tr>
+      <w:tr>
+        <w:tc>
+          <w:tcPr>
+            <w:tcW w:type="dxa" w:w="1500"/>
+            <w:tcBorders>
+              <w:top w:val="single" w:color="CCCCCC" w:sz="1"/>
+              <w:left w:val="single" w:color="CCCCCC" w:sz="1"/>
+              <w:bottom w:val="single" w:color="CCCCCC" w:sz="1"/>
+              <w:right w:val="single" w:color="CCCCCC" w:sz="1"/>
+            </w:tcBorders>
+            <w:shd w:fill="FFFFFF" w:val="clear"/>
+            <w:tcMar>
+              <w:top w:type="dxa" w:w="80"/>
+              <w:left w:type="dxa" w:w="120"/>
+              <w:bottom w:type="dxa" w:w="80"/>
+              <w:right w:type="dxa" w:w="120"/>
+            </w:tcMar>
+          </w:tcPr>
+          <w:p>
+            <w:r>
+              <w:rPr>
+                <w:b w:val="false"/>
+                <w:bCs w:val="false"/>
+                <w:sz w:val="22"/>
+                <w:szCs w:val="22"/>
+              </w:rPr>
+              <w:t xml:space="preserve">950390a2</w:t>
+            </w:r>
+          </w:p>
+        </w:tc>
+        <w:tc>
+          <w:tcPr>
+            <w:tcW w:type="dxa" w:w="1800"/>
+            <w:tcBorders>
+              <w:top w:val="single" w:color="CCCCCC" w:sz="1"/>
+              <w:left w:val="single" w:color="CCCCCC" w:sz="1"/>
+              <w:bottom w:val="single" w:color="CCCCCC" w:sz="1"/>
+              <w:right w:val="single" w:color="CCCCCC" w:sz="1"/>
+            </w:tcBorders>
+            <w:shd w:fill="FFFFFF" w:val="clear"/>
+            <w:tcMar>
+              <w:top w:type="dxa" w:w="80"/>
+              <w:left w:type="dxa" w:w="120"/>
+              <w:bottom w:type="dxa" w:w="80"/>
+              <w:right w:type="dxa" w:w="120"/>
+            </w:tcMar>
+          </w:tcPr>
+          <w:p>
+            <w:r>
+              <w:rPr>
+                <w:b w:val="false"/>
+                <w:bCs w:val="false"/>
+                <w:sz w:val="22"/>
+                <w:szCs w:val="22"/>
+              </w:rPr>
+              <w:t xml:space="preserve">120 s</w:t>
+            </w:r>
+          </w:p>
+        </w:tc>
+        <w:tc>
+          <w:tcPr>
+            <w:tcW w:type="dxa" w:w="1800"/>
+            <w:tcBorders>
+              <w:top w:val="single" w:color="CCCCCC" w:sz="1"/>
+              <w:left w:val="single" w:color="CCCCCC" w:sz="1"/>
+              <w:bottom w:val="single" w:color="CCCCCC" w:sz="1"/>
+              <w:right w:val="single" w:color="CCCCCC" w:sz="1"/>
+            </w:tcBorders>
+            <w:shd w:fill="FFFFFF" w:val="clear"/>
+            <w:tcMar>
+              <w:top w:type="dxa" w:w="80"/>
+              <w:left w:type="dxa" w:w="120"/>
+              <w:bottom w:type="dxa" w:w="80"/>
+              <w:right w:type="dxa" w:w="120"/>
+            </w:tcMar>
+          </w:tcPr>
+          <w:p>
+            <w:r>
+              <w:rPr>
+                <w:b w:val="false"/>
+                <w:bCs w:val="false"/>
+                <w:sz w:val="22"/>
+                <w:szCs w:val="22"/>
+              </w:rPr>
+              <w:t xml:space="preserve">1200 s</w:t>
+            </w:r>
+          </w:p>
+        </w:tc>
+        <w:tc>
+          <w:tcPr>
+            <w:tcW w:type="dxa" w:w="2260"/>
+            <w:tcBorders>
+              <w:top w:val="single" w:color="CCCCCC" w:sz="1"/>
+              <w:left w:val="single" w:color="CCCCCC" w:sz="1"/>
+              <w:bottom w:val="single" w:color="CCCCCC" w:sz="1"/>
+              <w:right w:val="single" w:color="CCCCCC" w:sz="1"/>
+            </w:tcBorders>
+            <w:shd w:fill="FFFFFF" w:val="clear"/>
+            <w:tcMar>
+              <w:top w:type="dxa" w:w="80"/>
+              <w:left w:type="dxa" w:w="120"/>
+              <w:bottom w:type="dxa" w:w="80"/>
+              <w:right w:type="dxa" w:w="120"/>
+            </w:tcMar>
+          </w:tcPr>
+          <w:p>
+            <w:r>
+              <w:rPr>
+                <w:b w:val="false"/>
+                <w:bCs w:val="false"/>
+                <w:sz w:val="22"/>
+                <w:szCs w:val="22"/>
+              </w:rPr>
+              <w:t xml:space="preserve">-1080 s</w:t>
+            </w:r>
+          </w:p>
+        </w:tc>
+        <w:tc>
+          <w:tcPr>
+            <w:tcW w:type="dxa" w:w="2000"/>
+            <w:tcBorders>
+              <w:top w:val="single" w:color="CCCCCC" w:sz="1"/>
+              <w:left w:val="single" w:color="CCCCCC" w:sz="1"/>
+              <w:bottom w:val="single" w:color="CCCCCC" w:sz="1"/>
+              <w:right w:val="single" w:color="CCCCCC" w:sz="1"/>
+            </w:tcBorders>
+            <w:shd w:fill="FFFFFF" w:val="clear"/>
+            <w:tcMar>
+              <w:top w:type="dxa" w:w="80"/>
+              <w:left w:type="dxa" w:w="120"/>
+              <w:bottom w:type="dxa" w:w="80"/>
+              <w:right w:type="dxa" w:w="120"/>
+            </w:tcMar>
+          </w:tcPr>
+          <w:p>
+            <w:r>
+              <w:rPr>
+                <w:b w:val="false"/>
+                <w:bCs w:val="false"/>
+                <w:sz w:val="22"/>
+                <w:szCs w:val="22"/>
+              </w:rPr>
+              <w:t xml:space="preserve">0 / 60</w:t>
+            </w:r>
+          </w:p>
+        </w:tc>
+      </w:tr>
+      <w:tr>
+        <w:tc>
+          <w:tcPr>
+            <w:tcW w:type="dxa" w:w="1500"/>
+            <w:tcBorders>
+              <w:top w:val="single" w:color="CCCCCC" w:sz="1"/>
+              <w:left w:val="single" w:color="CCCCCC" w:sz="1"/>
+              <w:bottom w:val="single" w:color="CCCCCC" w:sz="1"/>
+              <w:right w:val="single" w:color="CCCCCC" w:sz="1"/>
+            </w:tcBorders>
+            <w:shd w:fill="FFFFFF" w:val="clear"/>
+            <w:tcMar>
+              <w:top w:type="dxa" w:w="80"/>
+              <w:left w:type="dxa" w:w="120"/>
+              <w:bottom w:type="dxa" w:w="80"/>
+              <w:right w:type="dxa" w:w="120"/>
+            </w:tcMar>
+          </w:tcPr>
+          <w:p>
+            <w:r>
+              <w:rPr>
+                <w:b w:val="false"/>
+                <w:bCs w:val="false"/>
+                <w:sz w:val="22"/>
+                <w:szCs w:val="22"/>
+              </w:rPr>
+              <w:t xml:space="preserve">3c2e7753</w:t>
+            </w:r>
+          </w:p>
+        </w:tc>
+        <w:tc>
+          <w:tcPr>
+            <w:tcW w:type="dxa" w:w="1800"/>
+            <w:tcBorders>
+              <w:top w:val="single" w:color="CCCCCC" w:sz="1"/>
+              <w:left w:val="single" w:color="CCCCCC" w:sz="1"/>
+              <w:bottom w:val="single" w:color="CCCCCC" w:sz="1"/>
+              <w:right w:val="single" w:color="CCCCCC" w:sz="1"/>
+            </w:tcBorders>
+            <w:shd w:fill="FFFFFF" w:val="clear"/>
+            <w:tcMar>
+              <w:top w:type="dxa" w:w="80"/>
+              <w:left w:type="dxa" w:w="120"/>
+              <w:bottom w:type="dxa" w:w="80"/>
+              <w:right w:type="dxa" w:w="120"/>
+            </w:tcMar>
+          </w:tcPr>
+          <w:p>
+            <w:r>
+              <w:rPr>
+                <w:b w:val="false"/>
+                <w:bCs w:val="false"/>
+                <w:sz w:val="22"/>
+                <w:szCs w:val="22"/>
+              </w:rPr>
+              <w:t xml:space="preserve">120 s</w:t>
+            </w:r>
+          </w:p>
+        </w:tc>
+        <w:tc>
+          <w:tcPr>
+            <w:tcW w:type="dxa" w:w="1800"/>
+            <w:tcBorders>
+              <w:top w:val="single" w:color="CCCCCC" w:sz="1"/>
+              <w:left w:val="single" w:color="CCCCCC" w:sz="1"/>
+              <w:bottom w:val="single" w:color="CCCCCC" w:sz="1"/>
+              <w:right w:val="single" w:color="CCCCCC" w:sz="1"/>
+            </w:tcBorders>
+            <w:shd w:fill="FFFFFF" w:val="clear"/>
+            <w:tcMar>
+              <w:top w:type="dxa" w:w="80"/>
+              <w:left w:type="dxa" w:w="120"/>
+              <w:bottom w:type="dxa" w:w="80"/>
+              <w:right w:type="dxa" w:w="120"/>
+            </w:tcMar>
+          </w:tcPr>
+          <w:p>
+            <w:r>
+              <w:rPr>
+                <w:b w:val="false"/>
+                <w:bCs w:val="false"/>
+                <w:sz w:val="22"/>
+                <w:szCs w:val="22"/>
+              </w:rPr>
+              <w:t xml:space="preserve">1200 s</w:t>
+            </w:r>
+          </w:p>
+        </w:tc>
+        <w:tc>
+          <w:tcPr>
+            <w:tcW w:type="dxa" w:w="2260"/>
+            <w:tcBorders>
+              <w:top w:val="single" w:color="CCCCCC" w:sz="1"/>
+              <w:left w:val="single" w:color="CCCCCC" w:sz="1"/>
+              <w:bottom w:val="single" w:color="CCCCCC" w:sz="1"/>
+              <w:right w:val="single" w:color="CCCCCC" w:sz="1"/>
+            </w:tcBorders>
+            <w:shd w:fill="FFFFFF" w:val="clear"/>
+            <w:tcMar>
+              <w:top w:type="dxa" w:w="80"/>
+              <w:left w:type="dxa" w:w="120"/>
+              <w:bottom w:type="dxa" w:w="80"/>
+              <w:right w:type="dxa" w:w="120"/>
+            </w:tcMar>
+          </w:tcPr>
+          <w:p>
+            <w:r>
+              <w:rPr>
+                <w:b w:val="false"/>
+                <w:bCs w:val="false"/>
+                <w:sz w:val="22"/>
+                <w:szCs w:val="22"/>
+              </w:rPr>
+              <w:t xml:space="preserve">-1080 s</w:t>
+            </w:r>
+          </w:p>
+        </w:tc>
+        <w:tc>
+          <w:tcPr>
+            <w:tcW w:type="dxa" w:w="2000"/>
+            <w:tcBorders>
+              <w:top w:val="single" w:color="CCCCCC" w:sz="1"/>
+              <w:left w:val="single" w:color="CCCCCC" w:sz="1"/>
+              <w:bottom w:val="single" w:color="CCCCCC" w:sz="1"/>
+              <w:right w:val="single" w:color="CCCCCC" w:sz="1"/>
+            </w:tcBorders>
+            <w:shd w:fill="FFFFFF" w:val="clear"/>
+            <w:tcMar>
+              <w:top w:type="dxa" w:w="80"/>
+              <w:left w:type="dxa" w:w="120"/>
+              <w:bottom w:type="dxa" w:w="80"/>
+              <w:right w:type="dxa" w:w="120"/>
+            </w:tcMar>
+          </w:tcPr>
+          <w:p>
+            <w:r>
+              <w:rPr>
+                <w:b w:val="false"/>
+                <w:bCs w:val="false"/>
+                <w:sz w:val="22"/>
+                <w:szCs w:val="22"/>
+              </w:rPr>
+              <w:t xml:space="preserve">0 / 60</w:t>
+            </w:r>
+          </w:p>
+        </w:tc>
+      </w:tr>
+    </w:tbl>
+    <w:p>
+      <w:pPr>
+        <w:spacing w:after="160"/>
+      </w:pPr>
+      <w:r>
+        <w:rPr>
+          <w:sz w:val="24"/>
+          <w:szCs w:val="24"/>
+        </w:rPr>
+        <w:t xml:space="preserve">Analysis indicates that single mitigations like sprinklers alone are insufficient if activation occurs after visibility has already degraded (ASET remains at 70s). Incorporating fire compartmentalization (fire doors) yields the most significant jump in ASET (increasing to 120s) by preventing smoke propagation, while AI Signage and wider exit routes smooth agent flow to eliminate bottlenecks and reduce casualties to 0.</w:t>
       </w:r>
     </w:p>
     <w:p>

</xml_diff>